<commit_message>
feat(merchant): suivi des paiements factures + migration tables merchant
- Ajout du type PaymentMethod (virement, Wave, Orange Money, MTN MoMo…) et labels
- Champs payment_method/reference/note sur Invoice et InstallationFee
- Mutation recordInvoicePayment() dans db-client.ts
- Refacto page Factures → composant client FacturesClient
- Migration 030 : colonnes manquantes orgs/factories, 7 tables merchant, RLS bypass @bluwa.io
- Action getComponentArticles() pour le sélecteur BOM (articles MP/AC/CS actifs)

Co-Authored-By: Claude Sonnet 4.6 <noreply@anthropic.com>
</commit_message>
<xml_diff>
--- a/docs/bluwa_erp_guide_modules.docx
+++ b/docs/bluwa_erp_guide_modules.docx
@@ -134,29 +134,7 @@
           <w:sz w:val="54"/>
           <w:szCs w:val="54"/>
         </w:rPr>
-        <w:t>Et</w:t>
-      </w:r>
-      <w:r>
-        <w:rPr>
-          <w:rFonts w:ascii="Baskerville" w:hAnsi="Baskerville"/>
-          <w:b/>
-          <w:bCs/>
-          <w:color w:val="0F2E9E"/>
-          <w:sz w:val="54"/>
-          <w:szCs w:val="54"/>
-        </w:rPr>
-        <w:t xml:space="preserve"> </w:t>
-      </w:r>
-      <w:r>
-        <w:rPr>
-          <w:rFonts w:ascii="Baskerville" w:hAnsi="Baskerville"/>
-          <w:b/>
-          <w:bCs/>
-          <w:color w:val="0F2E9E"/>
-          <w:sz w:val="54"/>
-          <w:szCs w:val="54"/>
-        </w:rPr>
-        <w:t>Fonctionnalités</w:t>
+        <w:t>Et Fonctionnalités</w:t>
       </w:r>
     </w:p>
     <w:p>
@@ -200,7 +178,29 @@
           <w:sz w:val="28"/>
           <w:szCs w:val="28"/>
         </w:rPr>
-        <w:t>Afrique de l'Ouest</w:t>
+        <w:t>Afrique de l</w:t>
+      </w:r>
+      <w:r>
+        <w:rPr>
+          <w:rFonts w:ascii="Baskerville" w:hAnsi="Baskerville"/>
+          <w:i/>
+          <w:iCs/>
+          <w:color w:val="6B7280"/>
+          <w:sz w:val="28"/>
+          <w:szCs w:val="28"/>
+        </w:rPr>
+        <w:t>’</w:t>
+      </w:r>
+      <w:r>
+        <w:rPr>
+          <w:rFonts w:ascii="Baskerville" w:hAnsi="Baskerville"/>
+          <w:i/>
+          <w:iCs/>
+          <w:color w:val="6B7280"/>
+          <w:sz w:val="28"/>
+          <w:szCs w:val="28"/>
+        </w:rPr>
+        <w:t>Ouest</w:t>
       </w:r>
     </w:p>
     <w:p>
@@ -1230,18 +1230,7 @@
                 <w:sz w:val="18"/>
                 <w:szCs w:val="18"/>
               </w:rPr>
-              <w:t>Prévisions</w:t>
-            </w:r>
-            <w:r>
-              <w:rPr>
-                <w:rFonts w:ascii="Baskerville" w:hAnsi="Baskerville"/>
-                <w:b/>
-                <w:bCs/>
-                <w:color w:val="1E40AF"/>
-                <w:sz w:val="18"/>
-                <w:szCs w:val="18"/>
-              </w:rPr>
-              <w:t xml:space="preserve"> </w:t>
+              <w:t xml:space="preserve">Prévisions </w:t>
             </w:r>
             <w:r>
               <w:rPr>
@@ -1801,18 +1790,7 @@
                 <w:sz w:val="18"/>
                 <w:szCs w:val="18"/>
               </w:rPr>
-              <w:t>Réception</w:t>
-            </w:r>
-            <w:r>
-              <w:rPr>
-                <w:rFonts w:ascii="Baskerville" w:hAnsi="Baskerville"/>
-                <w:b/>
-                <w:bCs/>
-                <w:color w:val="4C1D95"/>
-                <w:sz w:val="18"/>
-                <w:szCs w:val="18"/>
-              </w:rPr>
-              <w:t xml:space="preserve"> (lot en QC)</w:t>
+              <w:t>Réception (lot en QC)</w:t>
             </w:r>
           </w:p>
         </w:tc>
@@ -1891,40 +1869,7 @@
                 <w:sz w:val="18"/>
                 <w:szCs w:val="18"/>
               </w:rPr>
-              <w:t>Libération</w:t>
-            </w:r>
-            <w:r>
-              <w:rPr>
-                <w:rFonts w:ascii="Baskerville" w:hAnsi="Baskerville"/>
-                <w:b/>
-                <w:bCs/>
-                <w:color w:val="FFFFFF"/>
-                <w:sz w:val="18"/>
-                <w:szCs w:val="18"/>
-              </w:rPr>
-              <w:t xml:space="preserve"> </w:t>
-            </w:r>
-            <w:r>
-              <w:rPr>
-                <w:rFonts w:ascii="Baskerville" w:hAnsi="Baskerville"/>
-                <w:b/>
-                <w:bCs/>
-                <w:color w:val="FFFFFF"/>
-                <w:sz w:val="18"/>
-                <w:szCs w:val="18"/>
-              </w:rPr>
-              <w:t>qualité</w:t>
-            </w:r>
-            <w:r>
-              <w:rPr>
-                <w:rFonts w:ascii="Baskerville" w:hAnsi="Baskerville"/>
-                <w:b/>
-                <w:bCs/>
-                <w:color w:val="FFFFFF"/>
-                <w:sz w:val="18"/>
-                <w:szCs w:val="18"/>
-              </w:rPr>
-              <w:t xml:space="preserve"> </w:t>
+              <w:t xml:space="preserve">Libération qualité </w:t>
             </w:r>
             <w:r>
               <w:rPr>
@@ -2458,18 +2403,7 @@
                 <w:sz w:val="18"/>
                 <w:szCs w:val="18"/>
               </w:rPr>
-              <w:t>Libération</w:t>
-            </w:r>
-            <w:r>
-              <w:rPr>
-                <w:rFonts w:ascii="Baskerville" w:hAnsi="Baskerville"/>
-                <w:b/>
-                <w:bCs/>
-                <w:color w:val="065F46"/>
-                <w:sz w:val="18"/>
-                <w:szCs w:val="18"/>
-              </w:rPr>
-              <w:t xml:space="preserve"> des lots</w:t>
+              <w:t>Libération des lots</w:t>
             </w:r>
           </w:p>
         </w:tc>
@@ -2548,18 +2482,7 @@
                 <w:sz w:val="18"/>
                 <w:szCs w:val="18"/>
               </w:rPr>
-              <w:t>Non-conformités</w:t>
-            </w:r>
-            <w:r>
-              <w:rPr>
-                <w:rFonts w:ascii="Baskerville" w:hAnsi="Baskerville"/>
-                <w:b/>
-                <w:bCs/>
-                <w:color w:val="065F46"/>
-                <w:sz w:val="18"/>
-                <w:szCs w:val="18"/>
-              </w:rPr>
-              <w:t xml:space="preserve"> (NC)</w:t>
+              <w:t>Non-conformités (NC)</w:t>
             </w:r>
           </w:p>
         </w:tc>
@@ -2638,29 +2561,7 @@
                 <w:sz w:val="18"/>
                 <w:szCs w:val="18"/>
               </w:rPr>
-              <w:t>Généalogie</w:t>
-            </w:r>
-            <w:r>
-              <w:rPr>
-                <w:rFonts w:ascii="Baskerville" w:hAnsi="Baskerville"/>
-                <w:b/>
-                <w:bCs/>
-                <w:color w:val="065F46"/>
-                <w:sz w:val="18"/>
-                <w:szCs w:val="18"/>
-              </w:rPr>
-              <w:t xml:space="preserve"> &amp; </w:t>
-            </w:r>
-            <w:r>
-              <w:rPr>
-                <w:rFonts w:ascii="Baskerville" w:hAnsi="Baskerville"/>
-                <w:b/>
-                <w:bCs/>
-                <w:color w:val="065F46"/>
-                <w:sz w:val="18"/>
-                <w:szCs w:val="18"/>
-              </w:rPr>
-              <w:t>Traçabilité</w:t>
+              <w:t>Généalogie &amp; Traçabilité</w:t>
             </w:r>
           </w:p>
         </w:tc>
@@ -3402,15 +3303,7 @@
                 <w:sz w:val="18"/>
                 <w:szCs w:val="18"/>
               </w:rPr>
-              <w:t>Qualité</w:t>
-            </w:r>
-            <w:r>
-              <w:rPr>
-                <w:rFonts w:ascii="Baskerville" w:hAnsi="Baskerville"/>
-                <w:sz w:val="18"/>
-                <w:szCs w:val="18"/>
-              </w:rPr>
-              <w:t xml:space="preserve"> (transversal)</w:t>
+              <w:t>Qualité (transversal)</w:t>
             </w:r>
           </w:p>
         </w:tc>
@@ -3903,15 +3796,7 @@
           <w:sz w:val="24"/>
           <w:szCs w:val="24"/>
         </w:rPr>
-        <w:t>Fonctionnalités</w:t>
-      </w:r>
-      <w:r>
-        <w:rPr>
-          <w:rFonts w:ascii="Baskerville" w:hAnsi="Baskerville"/>
-          <w:sz w:val="24"/>
-          <w:szCs w:val="24"/>
-        </w:rPr>
-        <w:t xml:space="preserve"> </w:t>
+        <w:t xml:space="preserve">Fonctionnalités </w:t>
       </w:r>
       <w:r>
         <w:rPr>
@@ -4942,15 +4827,7 @@
           <w:sz w:val="24"/>
           <w:szCs w:val="24"/>
         </w:rPr>
-        <w:t>Fonctionnalités</w:t>
-      </w:r>
-      <w:r>
-        <w:rPr>
-          <w:rFonts w:ascii="Baskerville" w:hAnsi="Baskerville"/>
-          <w:sz w:val="24"/>
-          <w:szCs w:val="24"/>
-        </w:rPr>
-        <w:t xml:space="preserve"> </w:t>
+        <w:t xml:space="preserve">Fonctionnalités </w:t>
       </w:r>
       <w:r>
         <w:rPr>
@@ -4981,15 +4858,7 @@
           <w:sz w:val="22"/>
           <w:szCs w:val="22"/>
         </w:rPr>
-        <w:t>Matières</w:t>
-      </w:r>
-      <w:r>
-        <w:rPr>
-          <w:rFonts w:ascii="Baskerville" w:hAnsi="Baskerville"/>
-          <w:sz w:val="22"/>
-          <w:szCs w:val="22"/>
-        </w:rPr>
-        <w:t xml:space="preserve"> </w:t>
+        <w:t xml:space="preserve">Matières </w:t>
       </w:r>
       <w:r>
         <w:rPr>
@@ -5488,13 +5357,7 @@
               <w:rPr>
                 <w:rFonts w:ascii="Baskerville" w:hAnsi="Baskerville"/>
               </w:rPr>
-              <w:t>Matière</w:t>
-            </w:r>
-            <w:r>
-              <w:rPr>
-                <w:rFonts w:ascii="Baskerville" w:hAnsi="Baskerville"/>
-              </w:rPr>
-              <w:t xml:space="preserve"> </w:t>
+              <w:t xml:space="preserve">Matière </w:t>
             </w:r>
             <w:r>
               <w:rPr>
@@ -6509,23 +6372,7 @@
           <w:szCs w:val="24"/>
         </w:rPr>
         <w:lastRenderedPageBreak/>
-        <w:t>Fonctionnalités</w:t>
-      </w:r>
-      <w:r>
-        <w:rPr>
-          <w:rFonts w:ascii="Baskerville" w:hAnsi="Baskerville"/>
-          <w:sz w:val="24"/>
-          <w:szCs w:val="24"/>
-        </w:rPr>
-        <w:t xml:space="preserve"> </w:t>
-      </w:r>
-      <w:r>
-        <w:rPr>
-          <w:rFonts w:ascii="Baskerville" w:hAnsi="Baskerville"/>
-          <w:sz w:val="24"/>
-          <w:szCs w:val="24"/>
-        </w:rPr>
-        <w:t>clés</w:t>
+        <w:t>Fonctionnalités clés</w:t>
       </w:r>
     </w:p>
     <w:p>
@@ -6548,39 +6395,7 @@
           <w:sz w:val="22"/>
           <w:szCs w:val="22"/>
         </w:rPr>
-        <w:t>Coordonnées</w:t>
-      </w:r>
-      <w:r>
-        <w:rPr>
-          <w:rFonts w:ascii="Baskerville" w:hAnsi="Baskerville"/>
-          <w:sz w:val="22"/>
-          <w:szCs w:val="22"/>
-        </w:rPr>
-        <w:t xml:space="preserve"> </w:t>
-      </w:r>
-      <w:r>
-        <w:rPr>
-          <w:rFonts w:ascii="Baskerville" w:hAnsi="Baskerville"/>
-          <w:sz w:val="22"/>
-          <w:szCs w:val="22"/>
-        </w:rPr>
-        <w:t>complètes</w:t>
-      </w:r>
-      <w:r>
-        <w:rPr>
-          <w:rFonts w:ascii="Baskerville" w:hAnsi="Baskerville"/>
-          <w:sz w:val="22"/>
-          <w:szCs w:val="22"/>
-        </w:rPr>
-        <w:t xml:space="preserve"> et contacts </w:t>
-      </w:r>
-      <w:r>
-        <w:rPr>
-          <w:rFonts w:ascii="Baskerville" w:hAnsi="Baskerville"/>
-          <w:sz w:val="22"/>
-          <w:szCs w:val="22"/>
-        </w:rPr>
-        <w:t>opérationnels</w:t>
+        <w:t>Coordonnées complètes et contacts opérationnels</w:t>
       </w:r>
     </w:p>
     <w:p>
@@ -7123,23 +6938,7 @@
           <w:sz w:val="24"/>
           <w:szCs w:val="24"/>
         </w:rPr>
-        <w:t>Fonctionnalités</w:t>
-      </w:r>
-      <w:r>
-        <w:rPr>
-          <w:rFonts w:ascii="Baskerville" w:hAnsi="Baskerville"/>
-          <w:sz w:val="24"/>
-          <w:szCs w:val="24"/>
-        </w:rPr>
-        <w:t xml:space="preserve"> </w:t>
-      </w:r>
-      <w:r>
-        <w:rPr>
-          <w:rFonts w:ascii="Baskerville" w:hAnsi="Baskerville"/>
-          <w:sz w:val="24"/>
-          <w:szCs w:val="24"/>
-        </w:rPr>
-        <w:t>clés</w:t>
+        <w:t>Fonctionnalités clés</w:t>
       </w:r>
     </w:p>
     <w:p>
@@ -7162,15 +6961,7 @@
           <w:sz w:val="22"/>
           <w:szCs w:val="22"/>
         </w:rPr>
-        <w:t>Coordonnées</w:t>
-      </w:r>
-      <w:r>
-        <w:rPr>
-          <w:rFonts w:ascii="Baskerville" w:hAnsi="Baskerville"/>
-          <w:sz w:val="22"/>
-          <w:szCs w:val="22"/>
-        </w:rPr>
-        <w:t xml:space="preserve"> et pays d</w:t>
+        <w:t>Coordonnées et pays d</w:t>
       </w:r>
       <w:r>
         <w:rPr>
@@ -7209,31 +7000,7 @@
           <w:sz w:val="22"/>
           <w:szCs w:val="22"/>
         </w:rPr>
-        <w:t>Délais</w:t>
-      </w:r>
-      <w:r>
-        <w:rPr>
-          <w:rFonts w:ascii="Baskerville" w:hAnsi="Baskerville"/>
-          <w:sz w:val="22"/>
-          <w:szCs w:val="22"/>
-        </w:rPr>
-        <w:t xml:space="preserve"> de livraison habituels et </w:t>
-      </w:r>
-      <w:r>
-        <w:rPr>
-          <w:rFonts w:ascii="Baskerville" w:hAnsi="Baskerville"/>
-          <w:sz w:val="22"/>
-          <w:szCs w:val="22"/>
-        </w:rPr>
-        <w:t>délais</w:t>
-      </w:r>
-      <w:r>
-        <w:rPr>
-          <w:rFonts w:ascii="Baskerville" w:hAnsi="Baskerville"/>
-          <w:sz w:val="22"/>
-          <w:szCs w:val="22"/>
-        </w:rPr>
-        <w:t xml:space="preserve"> d</w:t>
+        <w:t>Délais de livraison habituels et délais d</w:t>
       </w:r>
       <w:r>
         <w:rPr>
@@ -7894,15 +7661,7 @@
           <w:sz w:val="26"/>
           <w:szCs w:val="26"/>
         </w:rPr>
-        <w:t>Prévisions</w:t>
-      </w:r>
-      <w:r>
-        <w:rPr>
-          <w:rFonts w:ascii="Baskerville" w:hAnsi="Baskerville"/>
-          <w:sz w:val="26"/>
-          <w:szCs w:val="26"/>
-        </w:rPr>
-        <w:t xml:space="preserve"> de ventes</w:t>
+        <w:t>Prévisions de ventes</w:t>
       </w:r>
     </w:p>
     <w:p>
@@ -8097,23 +7856,7 @@
           <w:sz w:val="24"/>
           <w:szCs w:val="24"/>
         </w:rPr>
-        <w:t>Fonctionnalités</w:t>
-      </w:r>
-      <w:r>
-        <w:rPr>
-          <w:rFonts w:ascii="Baskerville" w:hAnsi="Baskerville"/>
-          <w:sz w:val="24"/>
-          <w:szCs w:val="24"/>
-        </w:rPr>
-        <w:t xml:space="preserve"> </w:t>
-      </w:r>
-      <w:r>
-        <w:rPr>
-          <w:rFonts w:ascii="Baskerville" w:hAnsi="Baskerville"/>
-          <w:sz w:val="24"/>
-          <w:szCs w:val="24"/>
-        </w:rPr>
-        <w:t>clés</w:t>
+        <w:t>Fonctionnalités clés</w:t>
       </w:r>
     </w:p>
     <w:p>
@@ -8681,23 +8424,7 @@
           <w:sz w:val="24"/>
           <w:szCs w:val="24"/>
         </w:rPr>
-        <w:t>Fonctionnalités</w:t>
-      </w:r>
-      <w:r>
-        <w:rPr>
-          <w:rFonts w:ascii="Baskerville" w:hAnsi="Baskerville"/>
-          <w:sz w:val="24"/>
-          <w:szCs w:val="24"/>
-        </w:rPr>
-        <w:t xml:space="preserve"> </w:t>
-      </w:r>
-      <w:r>
-        <w:rPr>
-          <w:rFonts w:ascii="Baskerville" w:hAnsi="Baskerville"/>
-          <w:sz w:val="24"/>
-          <w:szCs w:val="24"/>
-        </w:rPr>
-        <w:t>clés</w:t>
+        <w:t>Fonctionnalités clés</w:t>
       </w:r>
     </w:p>
     <w:p>
@@ -9093,23 +8820,7 @@
           <w:szCs w:val="24"/>
         </w:rPr>
         <w:lastRenderedPageBreak/>
-        <w:t>Fonctionnalités</w:t>
-      </w:r>
-      <w:r>
-        <w:rPr>
-          <w:rFonts w:ascii="Baskerville" w:hAnsi="Baskerville"/>
-          <w:sz w:val="24"/>
-          <w:szCs w:val="24"/>
-        </w:rPr>
-        <w:t xml:space="preserve"> </w:t>
-      </w:r>
-      <w:r>
-        <w:rPr>
-          <w:rFonts w:ascii="Baskerville" w:hAnsi="Baskerville"/>
-          <w:sz w:val="24"/>
-          <w:szCs w:val="24"/>
-        </w:rPr>
-        <w:t>clés</w:t>
+        <w:t>Fonctionnalités clés</w:t>
       </w:r>
     </w:p>
     <w:p>
@@ -9201,15 +8912,7 @@
           <w:sz w:val="22"/>
           <w:szCs w:val="22"/>
         </w:rPr>
-        <w:t>Déclenchement</w:t>
-      </w:r>
-      <w:r>
-        <w:rPr>
-          <w:rFonts w:ascii="Baskerville" w:hAnsi="Baskerville"/>
-          <w:sz w:val="22"/>
-          <w:szCs w:val="22"/>
-        </w:rPr>
-        <w:t xml:space="preserve"> du MRP en 1 clic depuis les alertes de surcharge</w:t>
+        <w:t>Déclenchement du MRP en 1 clic depuis les alertes de surcharge</w:t>
       </w:r>
     </w:p>
     <w:p>
@@ -9700,23 +9403,7 @@
           <w:sz w:val="24"/>
           <w:szCs w:val="24"/>
         </w:rPr>
-        <w:t>Fonctionnalités</w:t>
-      </w:r>
-      <w:r>
-        <w:rPr>
-          <w:rFonts w:ascii="Baskerville" w:hAnsi="Baskerville"/>
-          <w:sz w:val="24"/>
-          <w:szCs w:val="24"/>
-        </w:rPr>
-        <w:t xml:space="preserve"> </w:t>
-      </w:r>
-      <w:r>
-        <w:rPr>
-          <w:rFonts w:ascii="Baskerville" w:hAnsi="Baskerville"/>
-          <w:sz w:val="24"/>
-          <w:szCs w:val="24"/>
-        </w:rPr>
-        <w:t>clés</w:t>
+        <w:t>Fonctionnalités clés</w:t>
       </w:r>
     </w:p>
     <w:p>
@@ -10494,23 +10181,7 @@
           <w:sz w:val="24"/>
           <w:szCs w:val="24"/>
         </w:rPr>
-        <w:t>Fonctionnalités</w:t>
-      </w:r>
-      <w:r>
-        <w:rPr>
-          <w:rFonts w:ascii="Baskerville" w:hAnsi="Baskerville"/>
-          <w:sz w:val="24"/>
-          <w:szCs w:val="24"/>
-        </w:rPr>
-        <w:t xml:space="preserve"> </w:t>
-      </w:r>
-      <w:r>
-        <w:rPr>
-          <w:rFonts w:ascii="Baskerville" w:hAnsi="Baskerville"/>
-          <w:sz w:val="24"/>
-          <w:szCs w:val="24"/>
-        </w:rPr>
-        <w:t>clés</w:t>
+        <w:t>Fonctionnalités clés</w:t>
       </w:r>
     </w:p>
     <w:p>
@@ -10533,15 +10204,7 @@
           <w:sz w:val="22"/>
           <w:szCs w:val="22"/>
         </w:rPr>
-        <w:t>Création</w:t>
-      </w:r>
-      <w:r>
-        <w:rPr>
-          <w:rFonts w:ascii="Baskerville" w:hAnsi="Baskerville"/>
-          <w:sz w:val="22"/>
-          <w:szCs w:val="22"/>
-        </w:rPr>
-        <w:t xml:space="preserve"> de bons de commande</w:t>
+        <w:t>Création de bons de commande</w:t>
       </w:r>
       <w:r>
         <w:rPr>
@@ -10557,23 +10220,7 @@
           <w:sz w:val="22"/>
           <w:szCs w:val="22"/>
         </w:rPr>
-        <w:t xml:space="preserve"> fournisseurs (articles, </w:t>
-      </w:r>
-      <w:r>
-        <w:rPr>
-          <w:rFonts w:ascii="Baskerville" w:hAnsi="Baskerville"/>
-          <w:sz w:val="22"/>
-          <w:szCs w:val="22"/>
-        </w:rPr>
-        <w:t>quantités</w:t>
-      </w:r>
-      <w:r>
-        <w:rPr>
-          <w:rFonts w:ascii="Baskerville" w:hAnsi="Baskerville"/>
-          <w:sz w:val="22"/>
-          <w:szCs w:val="22"/>
-        </w:rPr>
-        <w:t>, prix, date livraison)</w:t>
+        <w:t xml:space="preserve"> fournisseurs (articles, quantités, prix, date livraison)</w:t>
       </w:r>
     </w:p>
     <w:p>
@@ -10802,16 +10449,7 @@
                 <w:sz w:val="21"/>
                 <w:szCs w:val="21"/>
               </w:rPr>
-              <w:t>À la suite d’une</w:t>
-            </w:r>
-            <w:r>
-              <w:rPr>
-                <w:rFonts w:ascii="Baskerville" w:hAnsi="Baskerville"/>
-                <w:color w:val="065F46"/>
-                <w:sz w:val="21"/>
-                <w:szCs w:val="21"/>
-              </w:rPr>
-              <w:t xml:space="preserve"> recommandation MRP, l</w:t>
+              <w:t>À la suite d’une recommandation MRP, l</w:t>
             </w:r>
             <w:r>
               <w:rPr>
@@ -10829,97 +10467,7 @@
                 <w:sz w:val="21"/>
                 <w:szCs w:val="21"/>
               </w:rPr>
-              <w:t xml:space="preserve">acheteur ouvre le bon de commande </w:t>
-            </w:r>
-            <w:r>
-              <w:rPr>
-                <w:rFonts w:ascii="Baskerville" w:hAnsi="Baskerville"/>
-                <w:color w:val="065F46"/>
-                <w:sz w:val="21"/>
-                <w:szCs w:val="21"/>
-              </w:rPr>
-              <w:t>pré</w:t>
-            </w:r>
-            <w:r>
-              <w:rPr>
-                <w:rFonts w:ascii="Baskerville" w:hAnsi="Baskerville"/>
-                <w:color w:val="065F46"/>
-                <w:sz w:val="21"/>
-                <w:szCs w:val="21"/>
-              </w:rPr>
-              <w:t xml:space="preserve">-rempli pour 300 kg de gousses de vanille chez le fournisseur </w:t>
-            </w:r>
-            <w:r>
-              <w:rPr>
-                <w:rFonts w:ascii="Baskerville" w:hAnsi="Baskerville"/>
-                <w:color w:val="065F46"/>
-                <w:sz w:val="21"/>
-                <w:szCs w:val="21"/>
-              </w:rPr>
-              <w:t>Épices</w:t>
-            </w:r>
-            <w:r>
-              <w:rPr>
-                <w:rFonts w:ascii="Baskerville" w:hAnsi="Baskerville"/>
-                <w:color w:val="065F46"/>
-                <w:sz w:val="21"/>
-                <w:szCs w:val="21"/>
-              </w:rPr>
-              <w:t xml:space="preserve"> de Casamance. Il ajuste le prix, confirme, et envoie le BC. A la livraison, la </w:t>
-            </w:r>
-            <w:r>
-              <w:rPr>
-                <w:rFonts w:ascii="Baskerville" w:hAnsi="Baskerville"/>
-                <w:color w:val="065F46"/>
-                <w:sz w:val="21"/>
-                <w:szCs w:val="21"/>
-              </w:rPr>
-              <w:t>réception</w:t>
-            </w:r>
-            <w:r>
-              <w:rPr>
-                <w:rFonts w:ascii="Baskerville" w:hAnsi="Baskerville"/>
-                <w:color w:val="065F46"/>
-                <w:sz w:val="21"/>
-                <w:szCs w:val="21"/>
-              </w:rPr>
-              <w:t xml:space="preserve"> est </w:t>
-            </w:r>
-            <w:r>
-              <w:rPr>
-                <w:rFonts w:ascii="Baskerville" w:hAnsi="Baskerville"/>
-                <w:color w:val="065F46"/>
-                <w:sz w:val="21"/>
-                <w:szCs w:val="21"/>
-              </w:rPr>
-              <w:t>déclarée</w:t>
-            </w:r>
-            <w:r>
-              <w:rPr>
-                <w:rFonts w:ascii="Baskerville" w:hAnsi="Baskerville"/>
-                <w:color w:val="065F46"/>
-                <w:sz w:val="21"/>
-                <w:szCs w:val="21"/>
-              </w:rPr>
-              <w:t xml:space="preserve"> et le stock est automatiquement mis </w:t>
-            </w:r>
-            <w:r>
-              <w:rPr>
-                <w:rFonts w:ascii="Baskerville" w:hAnsi="Baskerville"/>
-                <w:color w:val="065F46"/>
-                <w:sz w:val="21"/>
-                <w:szCs w:val="21"/>
-              </w:rPr>
-              <w:t>à</w:t>
-            </w:r>
-            <w:r>
-              <w:rPr>
-                <w:rFonts w:ascii="Baskerville" w:hAnsi="Baskerville"/>
-                <w:color w:val="065F46"/>
-                <w:sz w:val="21"/>
-                <w:szCs w:val="21"/>
-              </w:rPr>
-              <w:t xml:space="preserve"> jour.</w:t>
+              <w:t>acheteur ouvre le bon de commande pré-rempli pour 300 kg de gousses de vanille chez le fournisseur Épices de Casamance. Il ajuste le prix, confirme, et envoie le BC. A la livraison, la réception est déclarée et le stock est automatiquement mis à jour.</w:t>
             </w:r>
           </w:p>
         </w:tc>
@@ -11224,23 +10772,7 @@
           <w:sz w:val="24"/>
           <w:szCs w:val="24"/>
         </w:rPr>
-        <w:t>Fonctionnalités</w:t>
-      </w:r>
-      <w:r>
-        <w:rPr>
-          <w:rFonts w:ascii="Baskerville" w:hAnsi="Baskerville"/>
-          <w:sz w:val="24"/>
-          <w:szCs w:val="24"/>
-        </w:rPr>
-        <w:t xml:space="preserve"> </w:t>
-      </w:r>
-      <w:r>
-        <w:rPr>
-          <w:rFonts w:ascii="Baskerville" w:hAnsi="Baskerville"/>
-          <w:sz w:val="24"/>
-          <w:szCs w:val="24"/>
-        </w:rPr>
-        <w:t>clés</w:t>
+        <w:t>Fonctionnalités clés</w:t>
       </w:r>
     </w:p>
     <w:p>
@@ -11263,15 +10795,7 @@
           <w:sz w:val="22"/>
           <w:szCs w:val="22"/>
         </w:rPr>
-        <w:t>Réception</w:t>
-      </w:r>
-      <w:r>
-        <w:rPr>
-          <w:rFonts w:ascii="Baskerville" w:hAnsi="Baskerville"/>
-          <w:sz w:val="22"/>
-          <w:szCs w:val="22"/>
-        </w:rPr>
-        <w:t xml:space="preserve"> partielle ou totale par rapport au bon de commande</w:t>
+        <w:t>Réception partielle ou totale par rapport au bon de commande</w:t>
       </w:r>
     </w:p>
     <w:p>
@@ -11745,36 +11269,25 @@
                 <w:sz w:val="21"/>
                 <w:szCs w:val="21"/>
               </w:rPr>
-              <w:t>’</w:t>
-            </w:r>
-            <w:proofErr w:type="spellStart"/>
-            <w:r>
-              <w:rPr>
-                <w:rFonts w:ascii="Baskerville" w:hAnsi="Baskerville"/>
-                <w:color w:val="065F46"/>
-                <w:sz w:val="21"/>
-                <w:szCs w:val="21"/>
-              </w:rPr>
-              <w:t>à</w:t>
-            </w:r>
-            <w:r>
-              <w:rPr>
-                <w:rFonts w:ascii="Baskerville" w:hAnsi="Baskerville"/>
-                <w:color w:val="065F46"/>
-                <w:sz w:val="21"/>
-                <w:szCs w:val="21"/>
-              </w:rPr>
-              <w:t>ce</w:t>
-            </w:r>
-            <w:proofErr w:type="spellEnd"/>
-            <w:r>
-              <w:rPr>
-                <w:rFonts w:ascii="Baskerville" w:hAnsi="Baskerville"/>
-                <w:color w:val="065F46"/>
-                <w:sz w:val="21"/>
-                <w:szCs w:val="21"/>
-              </w:rPr>
-              <w:t xml:space="preserve"> que le labo confirme la </w:t>
+              <w:t>’à</w:t>
+            </w:r>
+            <w:r>
+              <w:rPr>
+                <w:rFonts w:ascii="Baskerville" w:hAnsi="Baskerville"/>
+                <w:color w:val="065F46"/>
+                <w:sz w:val="21"/>
+                <w:szCs w:val="21"/>
+              </w:rPr>
+              <w:t xml:space="preserve"> </w:t>
+            </w:r>
+            <w:r>
+              <w:rPr>
+                <w:rFonts w:ascii="Baskerville" w:hAnsi="Baskerville"/>
+                <w:color w:val="065F46"/>
+                <w:sz w:val="21"/>
+                <w:szCs w:val="21"/>
+              </w:rPr>
+              <w:t xml:space="preserve">ce que le labo confirme la </w:t>
             </w:r>
             <w:r>
               <w:rPr>
@@ -12045,23 +11558,7 @@
           <w:sz w:val="24"/>
           <w:szCs w:val="24"/>
         </w:rPr>
-        <w:t>Fonctionnalités</w:t>
-      </w:r>
-      <w:r>
-        <w:rPr>
-          <w:rFonts w:ascii="Baskerville" w:hAnsi="Baskerville"/>
-          <w:sz w:val="24"/>
-          <w:szCs w:val="24"/>
-        </w:rPr>
-        <w:t xml:space="preserve"> </w:t>
-      </w:r>
-      <w:r>
-        <w:rPr>
-          <w:rFonts w:ascii="Baskerville" w:hAnsi="Baskerville"/>
-          <w:sz w:val="24"/>
-          <w:szCs w:val="24"/>
-        </w:rPr>
-        <w:t>clés</w:t>
+        <w:t>Fonctionnalités clés</w:t>
       </w:r>
     </w:p>
     <w:p>
@@ -12756,23 +12253,7 @@
           <w:sz w:val="24"/>
           <w:szCs w:val="24"/>
         </w:rPr>
-        <w:t>Fonctionnalités</w:t>
-      </w:r>
-      <w:r>
-        <w:rPr>
-          <w:rFonts w:ascii="Baskerville" w:hAnsi="Baskerville"/>
-          <w:sz w:val="24"/>
-          <w:szCs w:val="24"/>
-        </w:rPr>
-        <w:t xml:space="preserve"> </w:t>
-      </w:r>
-      <w:r>
-        <w:rPr>
-          <w:rFonts w:ascii="Baskerville" w:hAnsi="Baskerville"/>
-          <w:sz w:val="24"/>
-          <w:szCs w:val="24"/>
-        </w:rPr>
-        <w:t>clés</w:t>
+        <w:t>Fonctionnalités clés</w:t>
       </w:r>
     </w:p>
     <w:p>
@@ -12795,15 +12276,7 @@
           <w:sz w:val="22"/>
           <w:szCs w:val="22"/>
         </w:rPr>
-        <w:t>Création</w:t>
-      </w:r>
-      <w:r>
-        <w:rPr>
-          <w:rFonts w:ascii="Baskerville" w:hAnsi="Baskerville"/>
-          <w:sz w:val="22"/>
-          <w:szCs w:val="22"/>
-        </w:rPr>
-        <w:t xml:space="preserve"> d'un document d</w:t>
+        <w:t>Création d'un document d</w:t>
       </w:r>
       <w:r>
         <w:rPr>
@@ -13668,23 +13141,7 @@
           <w:sz w:val="24"/>
           <w:szCs w:val="24"/>
         </w:rPr>
-        <w:t>Fonctionnalités</w:t>
-      </w:r>
-      <w:r>
-        <w:rPr>
-          <w:rFonts w:ascii="Baskerville" w:hAnsi="Baskerville"/>
-          <w:sz w:val="24"/>
-          <w:szCs w:val="24"/>
-        </w:rPr>
-        <w:t xml:space="preserve"> </w:t>
-      </w:r>
-      <w:r>
-        <w:rPr>
-          <w:rFonts w:ascii="Baskerville" w:hAnsi="Baskerville"/>
-          <w:sz w:val="24"/>
-          <w:szCs w:val="24"/>
-        </w:rPr>
-        <w:t>clés</w:t>
+        <w:t>Fonctionnalités clés</w:t>
       </w:r>
     </w:p>
     <w:p>
@@ -13707,15 +13164,7 @@
           <w:sz w:val="22"/>
           <w:szCs w:val="22"/>
         </w:rPr>
-        <w:t>Création</w:t>
-      </w:r>
-      <w:r>
-        <w:rPr>
-          <w:rFonts w:ascii="Baskerville" w:hAnsi="Baskerville"/>
-          <w:sz w:val="22"/>
-          <w:szCs w:val="22"/>
-        </w:rPr>
-        <w:t xml:space="preserve"> d</w:t>
+        <w:t>Création d</w:t>
       </w:r>
       <w:r>
         <w:rPr>
@@ -14446,23 +13895,7 @@
           <w:sz w:val="24"/>
           <w:szCs w:val="24"/>
         </w:rPr>
-        <w:t>Fonctionnalités</w:t>
-      </w:r>
-      <w:r>
-        <w:rPr>
-          <w:rFonts w:ascii="Baskerville" w:hAnsi="Baskerville"/>
-          <w:sz w:val="24"/>
-          <w:szCs w:val="24"/>
-        </w:rPr>
-        <w:t xml:space="preserve"> </w:t>
-      </w:r>
-      <w:r>
-        <w:rPr>
-          <w:rFonts w:ascii="Baskerville" w:hAnsi="Baskerville"/>
-          <w:sz w:val="24"/>
-          <w:szCs w:val="24"/>
-        </w:rPr>
-        <w:t>clés</w:t>
+        <w:t>Fonctionnalités clés</w:t>
       </w:r>
     </w:p>
     <w:p>
@@ -14508,31 +13941,7 @@
           <w:sz w:val="22"/>
           <w:szCs w:val="22"/>
         </w:rPr>
-        <w:t>Démarrage</w:t>
-      </w:r>
-      <w:r>
-        <w:rPr>
-          <w:rFonts w:ascii="Baskerville" w:hAnsi="Baskerville"/>
-          <w:sz w:val="22"/>
-          <w:szCs w:val="22"/>
-        </w:rPr>
-        <w:t xml:space="preserve"> et </w:t>
-      </w:r>
-      <w:r>
-        <w:rPr>
-          <w:rFonts w:ascii="Baskerville" w:hAnsi="Baskerville"/>
-          <w:sz w:val="22"/>
-          <w:szCs w:val="22"/>
-        </w:rPr>
-        <w:t>arrêt</w:t>
-      </w:r>
-      <w:r>
-        <w:rPr>
-          <w:rFonts w:ascii="Baskerville" w:hAnsi="Baskerville"/>
-          <w:sz w:val="22"/>
-          <w:szCs w:val="22"/>
-        </w:rPr>
-        <w:t xml:space="preserve"> de production avec horodatage</w:t>
+        <w:t>Démarrage et arrêt de production avec horodatage</w:t>
       </w:r>
     </w:p>
     <w:p>
@@ -15134,23 +14543,7 @@
           <w:sz w:val="24"/>
           <w:szCs w:val="24"/>
         </w:rPr>
-        <w:t>Fonctionnalités</w:t>
-      </w:r>
-      <w:r>
-        <w:rPr>
-          <w:rFonts w:ascii="Baskerville" w:hAnsi="Baskerville"/>
-          <w:sz w:val="24"/>
-          <w:szCs w:val="24"/>
-        </w:rPr>
-        <w:t xml:space="preserve"> </w:t>
-      </w:r>
-      <w:r>
-        <w:rPr>
-          <w:rFonts w:ascii="Baskerville" w:hAnsi="Baskerville"/>
-          <w:sz w:val="24"/>
-          <w:szCs w:val="24"/>
-        </w:rPr>
-        <w:t>clés</w:t>
+        <w:t>Fonctionnalités clés</w:t>
       </w:r>
     </w:p>
     <w:p>
@@ -15825,23 +15218,7 @@
           <w:sz w:val="24"/>
           <w:szCs w:val="24"/>
         </w:rPr>
-        <w:t>Fonctionnalités</w:t>
-      </w:r>
-      <w:r>
-        <w:rPr>
-          <w:rFonts w:ascii="Baskerville" w:hAnsi="Baskerville"/>
-          <w:sz w:val="24"/>
-          <w:szCs w:val="24"/>
-        </w:rPr>
-        <w:t xml:space="preserve"> </w:t>
-      </w:r>
-      <w:r>
-        <w:rPr>
-          <w:rFonts w:ascii="Baskerville" w:hAnsi="Baskerville"/>
-          <w:sz w:val="24"/>
-          <w:szCs w:val="24"/>
-        </w:rPr>
-        <w:t>clés</w:t>
+        <w:t>Fonctionnalités clés</w:t>
       </w:r>
     </w:p>
     <w:p>
@@ -15973,47 +15350,7 @@
           <w:sz w:val="22"/>
           <w:szCs w:val="22"/>
         </w:rPr>
-        <w:t>Résultats</w:t>
-      </w:r>
-      <w:r>
-        <w:rPr>
-          <w:rFonts w:ascii="Baskerville" w:hAnsi="Baskerville"/>
-          <w:sz w:val="22"/>
-          <w:szCs w:val="22"/>
-        </w:rPr>
-        <w:t xml:space="preserve"> des </w:t>
-      </w:r>
-      <w:r>
-        <w:rPr>
-          <w:rFonts w:ascii="Baskerville" w:hAnsi="Baskerville"/>
-          <w:sz w:val="22"/>
-          <w:szCs w:val="22"/>
-        </w:rPr>
-        <w:t>contrôles</w:t>
-      </w:r>
-      <w:r>
-        <w:rPr>
-          <w:rFonts w:ascii="Baskerville" w:hAnsi="Baskerville"/>
-          <w:sz w:val="22"/>
-          <w:szCs w:val="22"/>
-        </w:rPr>
-        <w:t xml:space="preserve"> </w:t>
-      </w:r>
-      <w:r>
-        <w:rPr>
-          <w:rFonts w:ascii="Baskerville" w:hAnsi="Baskerville"/>
-          <w:sz w:val="22"/>
-          <w:szCs w:val="22"/>
-        </w:rPr>
-        <w:t>qualité</w:t>
-      </w:r>
-      <w:r>
-        <w:rPr>
-          <w:rFonts w:ascii="Baskerville" w:hAnsi="Baskerville"/>
-          <w:sz w:val="22"/>
-          <w:szCs w:val="22"/>
-        </w:rPr>
-        <w:t xml:space="preserve"> associ</w:t>
+        <w:t>Résultats des contrôles qualité associ</w:t>
       </w:r>
       <w:r>
         <w:rPr>
@@ -16270,7 +15607,27 @@
                 <w:sz w:val="21"/>
                 <w:szCs w:val="21"/>
               </w:rPr>
-              <w:t xml:space="preserve"> du fournisseur X, livre a Auchan et a 2 autres clients. La direction peut </w:t>
+              <w:t xml:space="preserve"> du fournisseur X, livre </w:t>
+            </w:r>
+            <w:proofErr w:type="gramStart"/>
+            <w:r>
+              <w:rPr>
+                <w:rFonts w:ascii="Baskerville" w:hAnsi="Baskerville"/>
+                <w:color w:val="065F46"/>
+                <w:sz w:val="21"/>
+                <w:szCs w:val="21"/>
+              </w:rPr>
+              <w:t>a</w:t>
+            </w:r>
+            <w:proofErr w:type="gramEnd"/>
+            <w:r>
+              <w:rPr>
+                <w:rFonts w:ascii="Baskerville" w:hAnsi="Baskerville"/>
+                <w:color w:val="065F46"/>
+                <w:sz w:val="21"/>
+                <w:szCs w:val="21"/>
+              </w:rPr>
+              <w:t xml:space="preserve"> Auchan et a 2 autres clients. La direction peut </w:t>
             </w:r>
             <w:r>
               <w:rPr>
@@ -16334,52 +15691,70 @@
         </w:rPr>
         <w:t xml:space="preserve">Ce module </w:t>
       </w:r>
-      <w:proofErr w:type="spellStart"/>
-      <w:r>
-        <w:rPr>
-          <w:rFonts w:ascii="Baskerville" w:hAnsi="Baskerville"/>
-          <w:sz w:val="22"/>
-          <w:szCs w:val="22"/>
-        </w:rPr>
-        <w:t>gere</w:t>
-      </w:r>
-      <w:proofErr w:type="spellEnd"/>
-      <w:r>
-        <w:rPr>
-          <w:rFonts w:ascii="Baskerville" w:hAnsi="Baskerville"/>
-          <w:sz w:val="22"/>
-          <w:szCs w:val="22"/>
-        </w:rPr>
-        <w:t xml:space="preserve"> l'</w:t>
-      </w:r>
-      <w:proofErr w:type="spellStart"/>
-      <w:r>
-        <w:rPr>
-          <w:rFonts w:ascii="Baskerville" w:hAnsi="Baskerville"/>
-          <w:sz w:val="22"/>
-          <w:szCs w:val="22"/>
-        </w:rPr>
-        <w:t>integralite</w:t>
-      </w:r>
-      <w:proofErr w:type="spellEnd"/>
-      <w:r>
-        <w:rPr>
-          <w:rFonts w:ascii="Baskerville" w:hAnsi="Baskerville"/>
-          <w:sz w:val="22"/>
-          <w:szCs w:val="22"/>
-        </w:rPr>
-        <w:t xml:space="preserve"> du cycle de vente : de la commande client a la facturation, en passant par la </w:t>
-      </w:r>
-      <w:proofErr w:type="spellStart"/>
-      <w:r>
-        <w:rPr>
-          <w:rFonts w:ascii="Baskerville" w:hAnsi="Baskerville"/>
-          <w:sz w:val="22"/>
-          <w:szCs w:val="22"/>
-        </w:rPr>
-        <w:t>preparation</w:t>
-      </w:r>
-      <w:proofErr w:type="spellEnd"/>
+      <w:r>
+        <w:rPr>
+          <w:rFonts w:ascii="Baskerville" w:hAnsi="Baskerville"/>
+          <w:sz w:val="22"/>
+          <w:szCs w:val="22"/>
+        </w:rPr>
+        <w:t>gère</w:t>
+      </w:r>
+      <w:r>
+        <w:rPr>
+          <w:rFonts w:ascii="Baskerville" w:hAnsi="Baskerville"/>
+          <w:sz w:val="22"/>
+          <w:szCs w:val="22"/>
+        </w:rPr>
+        <w:t xml:space="preserve"> l</w:t>
+      </w:r>
+      <w:r>
+        <w:rPr>
+          <w:rFonts w:ascii="Baskerville" w:hAnsi="Baskerville"/>
+          <w:sz w:val="22"/>
+          <w:szCs w:val="22"/>
+        </w:rPr>
+        <w:t>’</w:t>
+      </w:r>
+      <w:r>
+        <w:rPr>
+          <w:rFonts w:ascii="Baskerville" w:hAnsi="Baskerville"/>
+          <w:sz w:val="22"/>
+          <w:szCs w:val="22"/>
+        </w:rPr>
+        <w:t>intégralité</w:t>
+      </w:r>
+      <w:r>
+        <w:rPr>
+          <w:rFonts w:ascii="Baskerville" w:hAnsi="Baskerville"/>
+          <w:sz w:val="22"/>
+          <w:szCs w:val="22"/>
+        </w:rPr>
+        <w:t xml:space="preserve"> du cycle de vente : de la commande client </w:t>
+      </w:r>
+      <w:r>
+        <w:rPr>
+          <w:rFonts w:ascii="Baskerville" w:hAnsi="Baskerville"/>
+          <w:sz w:val="22"/>
+          <w:szCs w:val="22"/>
+        </w:rPr>
+        <w:t>à</w:t>
+      </w:r>
+      <w:r>
+        <w:rPr>
+          <w:rFonts w:ascii="Baskerville" w:hAnsi="Baskerville"/>
+          <w:sz w:val="22"/>
+          <w:szCs w:val="22"/>
+        </w:rPr>
+        <w:t xml:space="preserve"> la facturation, en passant par la </w:t>
+      </w:r>
+      <w:r>
+        <w:rPr>
+          <w:rFonts w:ascii="Baskerville" w:hAnsi="Baskerville"/>
+          <w:sz w:val="22"/>
+          <w:szCs w:val="22"/>
+        </w:rPr>
+        <w:t>préparation</w:t>
+      </w:r>
       <w:r>
         <w:rPr>
           <w:rFonts w:ascii="Baskerville" w:hAnsi="Baskerville"/>
@@ -16475,13 +15850,12 @@
               </w:rPr>
               <w:t xml:space="preserve">Commandes </w:t>
             </w:r>
-            <w:proofErr w:type="gramStart"/>
             <w:r>
               <w:rPr>
                 <w:rFonts w:ascii="Baskerville" w:eastAsia="Courier New" w:hAnsi="Baskerville" w:cs="Courier New"/>
                 <w:color w:val="92400E"/>
               </w:rPr>
-              <w:t xml:space="preserve">clients  </w:t>
+              <w:t xml:space="preserve">clients </w:t>
             </w:r>
             <w:r>
               <w:rPr>
@@ -16490,30 +15864,26 @@
               </w:rPr>
               <w:t>→</w:t>
             </w:r>
-            <w:proofErr w:type="gramEnd"/>
             <w:r>
               <w:rPr>
                 <w:rFonts w:ascii="Baskerville" w:eastAsia="Courier New" w:hAnsi="Baskerville" w:cs="Courier New"/>
                 <w:color w:val="92400E"/>
               </w:rPr>
-              <w:t xml:space="preserve">  Plan de demande (temps </w:t>
-            </w:r>
-            <w:proofErr w:type="spellStart"/>
-            <w:proofErr w:type="gramStart"/>
+              <w:t xml:space="preserve"> Plan</w:t>
+            </w:r>
             <w:r>
               <w:rPr>
                 <w:rFonts w:ascii="Baskerville" w:eastAsia="Courier New" w:hAnsi="Baskerville" w:cs="Courier New"/>
                 <w:color w:val="92400E"/>
               </w:rPr>
-              <w:t>reel</w:t>
-            </w:r>
-            <w:proofErr w:type="spellEnd"/>
+              <w:t xml:space="preserve"> de demande (temps </w:t>
+            </w:r>
             <w:r>
               <w:rPr>
                 <w:rFonts w:ascii="Baskerville" w:eastAsia="Courier New" w:hAnsi="Baskerville" w:cs="Courier New"/>
                 <w:color w:val="92400E"/>
               </w:rPr>
-              <w:t xml:space="preserve">)  </w:t>
+              <w:t xml:space="preserve">réel) </w:t>
             </w:r>
             <w:r>
               <w:rPr>
@@ -16522,13 +15892,19 @@
               </w:rPr>
               <w:t>→</w:t>
             </w:r>
-            <w:proofErr w:type="gramEnd"/>
             <w:r>
               <w:rPr>
                 <w:rFonts w:ascii="Baskerville" w:eastAsia="Courier New" w:hAnsi="Baskerville" w:cs="Courier New"/>
                 <w:color w:val="92400E"/>
               </w:rPr>
-              <w:t xml:space="preserve">  Supply Planning</w:t>
+              <w:t xml:space="preserve"> Supply</w:t>
+            </w:r>
+            <w:r>
+              <w:rPr>
+                <w:rFonts w:ascii="Baskerville" w:eastAsia="Courier New" w:hAnsi="Baskerville" w:cs="Courier New"/>
+                <w:color w:val="92400E"/>
+              </w:rPr>
+              <w:t xml:space="preserve"> Planning</w:t>
             </w:r>
           </w:p>
           <w:p>
@@ -16547,13 +15923,12 @@
               </w:rPr>
               <w:t xml:space="preserve">Commandes </w:t>
             </w:r>
-            <w:proofErr w:type="gramStart"/>
             <w:r>
               <w:rPr>
                 <w:rFonts w:ascii="Baskerville" w:eastAsia="Courier New" w:hAnsi="Baskerville" w:cs="Courier New"/>
                 <w:color w:val="92400E"/>
               </w:rPr>
-              <w:t xml:space="preserve">clients  </w:t>
+              <w:t xml:space="preserve">clients </w:t>
             </w:r>
             <w:r>
               <w:rPr>
@@ -16562,21 +15937,26 @@
               </w:rPr>
               <w:t>→</w:t>
             </w:r>
-            <w:proofErr w:type="gramEnd"/>
             <w:r>
               <w:rPr>
                 <w:rFonts w:ascii="Baskerville" w:eastAsia="Courier New" w:hAnsi="Baskerville" w:cs="Courier New"/>
                 <w:color w:val="92400E"/>
               </w:rPr>
-              <w:t xml:space="preserve">  Bons de </w:t>
-            </w:r>
-            <w:proofErr w:type="gramStart"/>
+              <w:t xml:space="preserve"> Bons</w:t>
+            </w:r>
             <w:r>
               <w:rPr>
                 <w:rFonts w:ascii="Baskerville" w:eastAsia="Courier New" w:hAnsi="Baskerville" w:cs="Courier New"/>
                 <w:color w:val="92400E"/>
               </w:rPr>
-              <w:t xml:space="preserve">livraison  </w:t>
+              <w:t xml:space="preserve"> de </w:t>
+            </w:r>
+            <w:r>
+              <w:rPr>
+                <w:rFonts w:ascii="Baskerville" w:eastAsia="Courier New" w:hAnsi="Baskerville" w:cs="Courier New"/>
+                <w:color w:val="92400E"/>
+              </w:rPr>
+              <w:t xml:space="preserve">livraison </w:t>
             </w:r>
             <w:r>
               <w:rPr>
@@ -16585,13 +15965,33 @@
               </w:rPr>
               <w:t>→</w:t>
             </w:r>
-            <w:proofErr w:type="gramEnd"/>
             <w:r>
               <w:rPr>
                 <w:rFonts w:ascii="Baskerville" w:eastAsia="Courier New" w:hAnsi="Baskerville" w:cs="Courier New"/>
                 <w:color w:val="92400E"/>
               </w:rPr>
-              <w:t xml:space="preserve">  Facturation ADV (FAC-YYYY-NNNN)</w:t>
+              <w:t xml:space="preserve"> Facturation</w:t>
+            </w:r>
+            <w:r>
+              <w:rPr>
+                <w:rFonts w:ascii="Baskerville" w:eastAsia="Courier New" w:hAnsi="Baskerville" w:cs="Courier New"/>
+                <w:color w:val="92400E"/>
+              </w:rPr>
+              <w:t xml:space="preserve"> ADV (FAC-YYYY-</w:t>
+            </w:r>
+            <w:r>
+              <w:rPr>
+                <w:rFonts w:ascii="Baskerville" w:eastAsia="Courier New" w:hAnsi="Baskerville" w:cs="Courier New"/>
+                <w:color w:val="92400E"/>
+              </w:rPr>
+              <w:t>XXXX</w:t>
+            </w:r>
+            <w:r>
+              <w:rPr>
+                <w:rFonts w:ascii="Baskerville" w:eastAsia="Courier New" w:hAnsi="Baskerville" w:cs="Courier New"/>
+                <w:color w:val="92400E"/>
+              </w:rPr>
+              <w:t>)</w:t>
             </w:r>
           </w:p>
         </w:tc>
@@ -16733,20 +16133,58 @@
                 <w:sz w:val="21"/>
                 <w:szCs w:val="21"/>
               </w:rPr>
-              <w:t xml:space="preserve">C'est ici qu'une commande client entre dans le </w:t>
-            </w:r>
-            <w:proofErr w:type="spellStart"/>
-            <w:r>
-              <w:rPr>
-                <w:rFonts w:ascii="Baskerville" w:hAnsi="Baskerville"/>
-                <w:i/>
-                <w:iCs/>
-                <w:sz w:val="21"/>
-                <w:szCs w:val="21"/>
-              </w:rPr>
-              <w:t>systeme</w:t>
-            </w:r>
-            <w:proofErr w:type="spellEnd"/>
+              <w:t>C</w:t>
+            </w:r>
+            <w:r>
+              <w:rPr>
+                <w:rFonts w:ascii="Baskerville" w:hAnsi="Baskerville"/>
+                <w:i/>
+                <w:iCs/>
+                <w:sz w:val="21"/>
+                <w:szCs w:val="21"/>
+              </w:rPr>
+              <w:t>’</w:t>
+            </w:r>
+            <w:r>
+              <w:rPr>
+                <w:rFonts w:ascii="Baskerville" w:hAnsi="Baskerville"/>
+                <w:i/>
+                <w:iCs/>
+                <w:sz w:val="21"/>
+                <w:szCs w:val="21"/>
+              </w:rPr>
+              <w:t>est ici qu</w:t>
+            </w:r>
+            <w:r>
+              <w:rPr>
+                <w:rFonts w:ascii="Baskerville" w:hAnsi="Baskerville"/>
+                <w:i/>
+                <w:iCs/>
+                <w:sz w:val="21"/>
+                <w:szCs w:val="21"/>
+              </w:rPr>
+              <w:t>’</w:t>
+            </w:r>
+            <w:r>
+              <w:rPr>
+                <w:rFonts w:ascii="Baskerville" w:hAnsi="Baskerville"/>
+                <w:i/>
+                <w:iCs/>
+                <w:sz w:val="21"/>
+                <w:szCs w:val="21"/>
+              </w:rPr>
+              <w:t xml:space="preserve">une commande client entre dans le </w:t>
+            </w:r>
+            <w:r>
+              <w:rPr>
+                <w:rFonts w:ascii="Baskerville" w:hAnsi="Baskerville"/>
+                <w:i/>
+                <w:iCs/>
+                <w:sz w:val="21"/>
+                <w:szCs w:val="21"/>
+              </w:rPr>
+              <w:t>système</w:t>
+            </w:r>
             <w:r>
               <w:rPr>
                 <w:rFonts w:ascii="Baskerville" w:hAnsi="Baskerville"/>
@@ -16757,18 +16195,16 @@
               </w:rPr>
               <w:t xml:space="preserve">. En quelques clics, vous saisissez le client, les articles commandes, les </w:t>
             </w:r>
-            <w:proofErr w:type="spellStart"/>
-            <w:r>
-              <w:rPr>
-                <w:rFonts w:ascii="Baskerville" w:hAnsi="Baskerville"/>
-                <w:i/>
-                <w:iCs/>
-                <w:sz w:val="21"/>
-                <w:szCs w:val="21"/>
-              </w:rPr>
-              <w:t>quantites</w:t>
-            </w:r>
-            <w:proofErr w:type="spellEnd"/>
+            <w:r>
+              <w:rPr>
+                <w:rFonts w:ascii="Baskerville" w:hAnsi="Baskerville"/>
+                <w:i/>
+                <w:iCs/>
+                <w:sz w:val="21"/>
+                <w:szCs w:val="21"/>
+              </w:rPr>
+              <w:t>quantités</w:t>
+            </w:r>
             <w:r>
               <w:rPr>
                 <w:rFonts w:ascii="Baskerville" w:hAnsi="Baskerville"/>
@@ -16779,18 +16215,16 @@
               </w:rPr>
               <w:t xml:space="preserve"> et la date de livraison </w:t>
             </w:r>
-            <w:proofErr w:type="spellStart"/>
-            <w:r>
-              <w:rPr>
-                <w:rFonts w:ascii="Baskerville" w:hAnsi="Baskerville"/>
-                <w:i/>
-                <w:iCs/>
-                <w:sz w:val="21"/>
-                <w:szCs w:val="21"/>
-              </w:rPr>
-              <w:t>souhaitee</w:t>
-            </w:r>
-            <w:proofErr w:type="spellEnd"/>
+            <w:r>
+              <w:rPr>
+                <w:rFonts w:ascii="Baskerville" w:hAnsi="Baskerville"/>
+                <w:i/>
+                <w:iCs/>
+                <w:sz w:val="21"/>
+                <w:szCs w:val="21"/>
+              </w:rPr>
+              <w:t>souhaitée</w:t>
+            </w:r>
             <w:r>
               <w:rPr>
                 <w:rFonts w:ascii="Baskerville" w:hAnsi="Baskerville"/>
@@ -16801,18 +16235,16 @@
               </w:rPr>
               <w:t xml:space="preserve">. La commande alimente automatiquement le Plan de demande et </w:t>
             </w:r>
-            <w:proofErr w:type="spellStart"/>
-            <w:r>
-              <w:rPr>
-                <w:rFonts w:ascii="Baskerville" w:hAnsi="Baskerville"/>
-                <w:i/>
-                <w:iCs/>
-                <w:sz w:val="21"/>
-                <w:szCs w:val="21"/>
-              </w:rPr>
-              <w:t>declenche</w:t>
-            </w:r>
-            <w:proofErr w:type="spellEnd"/>
+            <w:r>
+              <w:rPr>
+                <w:rFonts w:ascii="Baskerville" w:hAnsi="Baskerville"/>
+                <w:i/>
+                <w:iCs/>
+                <w:sz w:val="21"/>
+                <w:szCs w:val="21"/>
+              </w:rPr>
+              <w:t>déclenche</w:t>
+            </w:r>
             <w:r>
               <w:rPr>
                 <w:rFonts w:ascii="Baskerville" w:hAnsi="Baskerville"/>
@@ -16823,18 +16255,16 @@
               </w:rPr>
               <w:t xml:space="preserve"> la chaine de production si </w:t>
             </w:r>
-            <w:proofErr w:type="spellStart"/>
-            <w:r>
-              <w:rPr>
-                <w:rFonts w:ascii="Baskerville" w:hAnsi="Baskerville"/>
-                <w:i/>
-                <w:iCs/>
-                <w:sz w:val="21"/>
-                <w:szCs w:val="21"/>
-              </w:rPr>
-              <w:t>necessaire</w:t>
-            </w:r>
-            <w:proofErr w:type="spellEnd"/>
+            <w:r>
+              <w:rPr>
+                <w:rFonts w:ascii="Baskerville" w:hAnsi="Baskerville"/>
+                <w:i/>
+                <w:iCs/>
+                <w:sz w:val="21"/>
+                <w:szCs w:val="21"/>
+              </w:rPr>
+              <w:t>nécessaire</w:t>
+            </w:r>
             <w:r>
               <w:rPr>
                 <w:rFonts w:ascii="Baskerville" w:hAnsi="Baskerville"/>
@@ -16858,34 +16288,14 @@
           <w:szCs w:val="24"/>
         </w:rPr>
       </w:pPr>
-      <w:proofErr w:type="spellStart"/>
       <w:r>
         <w:rPr>
           <w:rFonts w:ascii="Baskerville" w:hAnsi="Baskerville"/>
           <w:sz w:val="24"/>
           <w:szCs w:val="24"/>
         </w:rPr>
-        <w:t>Fonctionnalites</w:t>
-      </w:r>
-      <w:proofErr w:type="spellEnd"/>
-      <w:r>
-        <w:rPr>
-          <w:rFonts w:ascii="Baskerville" w:hAnsi="Baskerville"/>
-          <w:sz w:val="24"/>
-          <w:szCs w:val="24"/>
-        </w:rPr>
-        <w:t xml:space="preserve"> </w:t>
-      </w:r>
-      <w:proofErr w:type="spellStart"/>
-      <w:r>
-        <w:rPr>
-          <w:rFonts w:ascii="Baskerville" w:hAnsi="Baskerville"/>
-          <w:sz w:val="24"/>
-          <w:szCs w:val="24"/>
-        </w:rPr>
-        <w:t>cles</w:t>
-      </w:r>
-      <w:proofErr w:type="spellEnd"/>
+        <w:t>Fonctionnalités clés</w:t>
+      </w:r>
     </w:p>
     <w:p>
       <w:pPr>
@@ -16901,41 +16311,13 @@
           <w:szCs w:val="22"/>
         </w:rPr>
       </w:pPr>
-      <w:proofErr w:type="spellStart"/>
-      <w:r>
-        <w:rPr>
-          <w:rFonts w:ascii="Baskerville" w:hAnsi="Baskerville"/>
-          <w:sz w:val="22"/>
-          <w:szCs w:val="22"/>
-        </w:rPr>
-        <w:t>Creation</w:t>
-      </w:r>
-      <w:proofErr w:type="spellEnd"/>
-      <w:r>
-        <w:rPr>
-          <w:rFonts w:ascii="Baskerville" w:hAnsi="Baskerville"/>
-          <w:sz w:val="22"/>
-          <w:szCs w:val="22"/>
-        </w:rPr>
-        <w:t xml:space="preserve"> de commande client avec lignes articles, </w:t>
-      </w:r>
-      <w:proofErr w:type="spellStart"/>
-      <w:r>
-        <w:rPr>
-          <w:rFonts w:ascii="Baskerville" w:hAnsi="Baskerville"/>
-          <w:sz w:val="22"/>
-          <w:szCs w:val="22"/>
-        </w:rPr>
-        <w:t>quantites</w:t>
-      </w:r>
-      <w:proofErr w:type="spellEnd"/>
-      <w:r>
-        <w:rPr>
-          <w:rFonts w:ascii="Baskerville" w:hAnsi="Baskerville"/>
-          <w:sz w:val="22"/>
-          <w:szCs w:val="22"/>
-        </w:rPr>
-        <w:t>, prix et date de livraison</w:t>
+      <w:r>
+        <w:rPr>
+          <w:rFonts w:ascii="Baskerville" w:hAnsi="Baskerville"/>
+          <w:sz w:val="22"/>
+          <w:szCs w:val="22"/>
+        </w:rPr>
+        <w:t>Création de commande client avec lignes articles, quantités, prix et date de livraison</w:t>
       </w:r>
     </w:p>
     <w:p>
@@ -16960,16 +16342,14 @@
         </w:rPr>
         <w:t xml:space="preserve">Lien automatique vers le Plan de demande — visible </w:t>
       </w:r>
-      <w:proofErr w:type="spellStart"/>
-      <w:r>
-        <w:rPr>
-          <w:rFonts w:ascii="Baskerville" w:hAnsi="Baskerville"/>
-          <w:sz w:val="22"/>
-          <w:szCs w:val="22"/>
-        </w:rPr>
-        <w:t>immediatement</w:t>
-      </w:r>
-      <w:proofErr w:type="spellEnd"/>
+      <w:r>
+        <w:rPr>
+          <w:rFonts w:ascii="Baskerville" w:hAnsi="Baskerville"/>
+          <w:sz w:val="22"/>
+          <w:szCs w:val="22"/>
+        </w:rPr>
+        <w:t>immédiatement</w:t>
+      </w:r>
       <w:r>
         <w:rPr>
           <w:rFonts w:ascii="Baskerville" w:hAnsi="Baskerville"/>
@@ -17017,16 +16397,14 @@
         </w:rPr>
         <w:t xml:space="preserve"> </w:t>
       </w:r>
-      <w:proofErr w:type="spellStart"/>
-      <w:r>
-        <w:rPr>
-          <w:rFonts w:ascii="Baskerville" w:hAnsi="Baskerville"/>
-          <w:sz w:val="22"/>
-          <w:szCs w:val="22"/>
-        </w:rPr>
-        <w:t>Confirmee</w:t>
-      </w:r>
-      <w:proofErr w:type="spellEnd"/>
+      <w:r>
+        <w:rPr>
+          <w:rFonts w:ascii="Baskerville" w:hAnsi="Baskerville"/>
+          <w:sz w:val="22"/>
+          <w:szCs w:val="22"/>
+        </w:rPr>
+        <w:t>Confirmée</w:t>
+      </w:r>
       <w:r>
         <w:rPr>
           <w:rFonts w:ascii="Baskerville" w:hAnsi="Baskerville"/>
@@ -17067,16 +16445,14 @@
         </w:rPr>
         <w:t xml:space="preserve"> </w:t>
       </w:r>
-      <w:proofErr w:type="spellStart"/>
-      <w:r>
-        <w:rPr>
-          <w:rFonts w:ascii="Baskerville" w:hAnsi="Baskerville"/>
-          <w:sz w:val="22"/>
-          <w:szCs w:val="22"/>
-        </w:rPr>
-        <w:t>Livree</w:t>
-      </w:r>
-      <w:proofErr w:type="spellEnd"/>
+      <w:r>
+        <w:rPr>
+          <w:rFonts w:ascii="Baskerville" w:hAnsi="Baskerville"/>
+          <w:sz w:val="22"/>
+          <w:szCs w:val="22"/>
+        </w:rPr>
+        <w:t>Livrée</w:t>
+      </w:r>
       <w:r>
         <w:rPr>
           <w:rFonts w:ascii="Baskerville" w:hAnsi="Baskerville"/>
@@ -17101,16 +16477,14 @@
         </w:rPr>
         <w:t xml:space="preserve"> </w:t>
       </w:r>
-      <w:proofErr w:type="spellStart"/>
-      <w:r>
-        <w:rPr>
-          <w:rFonts w:ascii="Baskerville" w:hAnsi="Baskerville"/>
-          <w:sz w:val="22"/>
-          <w:szCs w:val="22"/>
-        </w:rPr>
-        <w:t>Annulee</w:t>
-      </w:r>
-      <w:proofErr w:type="spellEnd"/>
+      <w:r>
+        <w:rPr>
+          <w:rFonts w:ascii="Baskerville" w:hAnsi="Baskerville"/>
+          <w:sz w:val="22"/>
+          <w:szCs w:val="22"/>
+        </w:rPr>
+        <w:t>Annulée</w:t>
+      </w:r>
     </w:p>
     <w:p>
       <w:pPr>
@@ -17149,23 +16523,13 @@
           <w:szCs w:val="22"/>
         </w:rPr>
       </w:pPr>
-      <w:proofErr w:type="spellStart"/>
-      <w:r>
-        <w:rPr>
-          <w:rFonts w:ascii="Baskerville" w:hAnsi="Baskerville"/>
-          <w:sz w:val="22"/>
-          <w:szCs w:val="22"/>
-        </w:rPr>
-        <w:t>Generation</w:t>
-      </w:r>
-      <w:proofErr w:type="spellEnd"/>
-      <w:r>
-        <w:rPr>
-          <w:rFonts w:ascii="Baskerville" w:hAnsi="Baskerville"/>
-          <w:sz w:val="22"/>
-          <w:szCs w:val="22"/>
-        </w:rPr>
-        <w:t xml:space="preserve"> du Bon de livraison et de la facture ADV depuis la commande</w:t>
+      <w:r>
+        <w:rPr>
+          <w:rFonts w:ascii="Baskerville" w:hAnsi="Baskerville"/>
+          <w:sz w:val="22"/>
+          <w:szCs w:val="22"/>
+        </w:rPr>
+        <w:t>Génération du Bon de livraison et de la facture ADV depuis la commande</w:t>
       </w:r>
     </w:p>
     <w:p>
@@ -17235,7 +16599,29 @@
                 <w:sz w:val="21"/>
                 <w:szCs w:val="21"/>
               </w:rPr>
-              <w:t>Exemple concret — Afrique de l'Ouest</w:t>
+              <w:t>Exemple concret — Afrique de l</w:t>
+            </w:r>
+            <w:r>
+              <w:rPr>
+                <w:rFonts w:ascii="Baskerville" w:hAnsi="Baskerville"/>
+                <w:b/>
+                <w:bCs/>
+                <w:color w:val="065F46"/>
+                <w:sz w:val="21"/>
+                <w:szCs w:val="21"/>
+              </w:rPr>
+              <w:t>’</w:t>
+            </w:r>
+            <w:r>
+              <w:rPr>
+                <w:rFonts w:ascii="Baskerville" w:hAnsi="Baskerville"/>
+                <w:b/>
+                <w:bCs/>
+                <w:color w:val="065F46"/>
+                <w:sz w:val="21"/>
+                <w:szCs w:val="21"/>
+              </w:rPr>
+              <w:t>Ouest</w:t>
             </w:r>
           </w:p>
           <w:p>
@@ -17255,17 +16641,15 @@
               </w:rPr>
               <w:t xml:space="preserve">Auchan Dakar commande 4 800 bouteilles de Jus Originale pour le 15 juin. La commande est saisie dans Bluwa et apparait </w:t>
             </w:r>
-            <w:proofErr w:type="spellStart"/>
-            <w:r>
-              <w:rPr>
-                <w:rFonts w:ascii="Baskerville" w:hAnsi="Baskerville"/>
-                <w:color w:val="065F46"/>
-                <w:sz w:val="21"/>
-                <w:szCs w:val="21"/>
-              </w:rPr>
-              <w:t>immediatement</w:t>
-            </w:r>
-            <w:proofErr w:type="spellEnd"/>
+            <w:r>
+              <w:rPr>
+                <w:rFonts w:ascii="Baskerville" w:hAnsi="Baskerville"/>
+                <w:color w:val="065F46"/>
+                <w:sz w:val="21"/>
+                <w:szCs w:val="21"/>
+              </w:rPr>
+              <w:t>immédiatement</w:t>
+            </w:r>
             <w:r>
               <w:rPr>
                 <w:rFonts w:ascii="Baskerville" w:hAnsi="Baskerville"/>
@@ -17275,17 +16659,15 @@
               </w:rPr>
               <w:t xml:space="preserve"> dans le Plan de demande de la semaine 2. Si la capacite est suffisante, la production est </w:t>
             </w:r>
-            <w:proofErr w:type="spellStart"/>
-            <w:r>
-              <w:rPr>
-                <w:rFonts w:ascii="Baskerville" w:hAnsi="Baskerville"/>
-                <w:color w:val="065F46"/>
-                <w:sz w:val="21"/>
-                <w:szCs w:val="21"/>
-              </w:rPr>
-              <w:t>lancee</w:t>
-            </w:r>
-            <w:proofErr w:type="spellEnd"/>
+            <w:r>
+              <w:rPr>
+                <w:rFonts w:ascii="Baskerville" w:hAnsi="Baskerville"/>
+                <w:color w:val="065F46"/>
+                <w:sz w:val="21"/>
+                <w:szCs w:val="21"/>
+              </w:rPr>
+              <w:t>lancée</w:t>
+            </w:r>
             <w:r>
               <w:rPr>
                 <w:rFonts w:ascii="Baskerville" w:hAnsi="Baskerville"/>
@@ -17295,17 +16677,15 @@
               </w:rPr>
               <w:t xml:space="preserve">. A la livraison, un bon de livraison est </w:t>
             </w:r>
-            <w:proofErr w:type="spellStart"/>
-            <w:r>
-              <w:rPr>
-                <w:rFonts w:ascii="Baskerville" w:hAnsi="Baskerville"/>
-                <w:color w:val="065F46"/>
-                <w:sz w:val="21"/>
-                <w:szCs w:val="21"/>
-              </w:rPr>
-              <w:t>genere</w:t>
-            </w:r>
-            <w:proofErr w:type="spellEnd"/>
+            <w:r>
+              <w:rPr>
+                <w:rFonts w:ascii="Baskerville" w:hAnsi="Baskerville"/>
+                <w:color w:val="065F46"/>
+                <w:sz w:val="21"/>
+                <w:szCs w:val="21"/>
+              </w:rPr>
+              <w:t>généré</w:t>
+            </w:r>
             <w:r>
               <w:rPr>
                 <w:rFonts w:ascii="Baskerville" w:hAnsi="Baskerville"/>
@@ -17457,18 +16837,16 @@
               </w:rPr>
               <w:t xml:space="preserve">Une fois la commande </w:t>
             </w:r>
-            <w:proofErr w:type="spellStart"/>
-            <w:r>
-              <w:rPr>
-                <w:rFonts w:ascii="Baskerville" w:hAnsi="Baskerville"/>
-                <w:i/>
-                <w:iCs/>
-                <w:sz w:val="21"/>
-                <w:szCs w:val="21"/>
-              </w:rPr>
-              <w:t>livree</w:t>
-            </w:r>
-            <w:proofErr w:type="spellEnd"/>
+            <w:r>
+              <w:rPr>
+                <w:rFonts w:ascii="Baskerville" w:hAnsi="Baskerville"/>
+                <w:i/>
+                <w:iCs/>
+                <w:sz w:val="21"/>
+                <w:szCs w:val="21"/>
+              </w:rPr>
+              <w:t>livrée</w:t>
+            </w:r>
             <w:r>
               <w:rPr>
                 <w:rFonts w:ascii="Baskerville" w:hAnsi="Baskerville"/>
@@ -17479,18 +16857,16 @@
               </w:rPr>
               <w:t xml:space="preserve">, la facture se </w:t>
             </w:r>
-            <w:proofErr w:type="spellStart"/>
-            <w:r>
-              <w:rPr>
-                <w:rFonts w:ascii="Baskerville" w:hAnsi="Baskerville"/>
-                <w:i/>
-                <w:iCs/>
-                <w:sz w:val="21"/>
-                <w:szCs w:val="21"/>
-              </w:rPr>
-              <w:t>genere</w:t>
-            </w:r>
-            <w:proofErr w:type="spellEnd"/>
+            <w:r>
+              <w:rPr>
+                <w:rFonts w:ascii="Baskerville" w:hAnsi="Baskerville"/>
+                <w:i/>
+                <w:iCs/>
+                <w:sz w:val="21"/>
+                <w:szCs w:val="21"/>
+              </w:rPr>
+              <w:t>génère</w:t>
+            </w:r>
             <w:r>
               <w:rPr>
                 <w:rFonts w:ascii="Baskerville" w:hAnsi="Baskerville"/>
@@ -17501,84 +16877,136 @@
               </w:rPr>
               <w:t xml:space="preserve"> automatiquement depuis les </w:t>
             </w:r>
-            <w:proofErr w:type="spellStart"/>
-            <w:r>
-              <w:rPr>
-                <w:rFonts w:ascii="Baskerville" w:hAnsi="Baskerville"/>
-                <w:i/>
-                <w:iCs/>
-                <w:sz w:val="21"/>
-                <w:szCs w:val="21"/>
-              </w:rPr>
-              <w:t>donnees</w:t>
-            </w:r>
-            <w:proofErr w:type="spellEnd"/>
-            <w:r>
-              <w:rPr>
-                <w:rFonts w:ascii="Baskerville" w:hAnsi="Baskerville"/>
-                <w:i/>
-                <w:iCs/>
-                <w:sz w:val="21"/>
-                <w:szCs w:val="21"/>
-              </w:rPr>
-              <w:t xml:space="preserve"> de la commande — client, articles, </w:t>
-            </w:r>
-            <w:proofErr w:type="spellStart"/>
-            <w:r>
-              <w:rPr>
-                <w:rFonts w:ascii="Baskerville" w:hAnsi="Baskerville"/>
-                <w:i/>
-                <w:iCs/>
-                <w:sz w:val="21"/>
-                <w:szCs w:val="21"/>
-              </w:rPr>
-              <w:t>quantites</w:t>
-            </w:r>
-            <w:proofErr w:type="spellEnd"/>
-            <w:r>
-              <w:rPr>
-                <w:rFonts w:ascii="Baskerville" w:hAnsi="Baskerville"/>
-                <w:i/>
-                <w:iCs/>
-                <w:sz w:val="21"/>
-                <w:szCs w:val="21"/>
-              </w:rPr>
-              <w:t xml:space="preserve">, prix. Plus de ressaisie, plus d'erreurs. La facture est </w:t>
-            </w:r>
-            <w:proofErr w:type="spellStart"/>
-            <w:r>
-              <w:rPr>
-                <w:rFonts w:ascii="Baskerville" w:hAnsi="Baskerville"/>
-                <w:i/>
-                <w:iCs/>
-                <w:sz w:val="21"/>
-                <w:szCs w:val="21"/>
-              </w:rPr>
-              <w:t>numerotee</w:t>
-            </w:r>
-            <w:proofErr w:type="spellEnd"/>
-            <w:r>
-              <w:rPr>
-                <w:rFonts w:ascii="Baskerville" w:hAnsi="Baskerville"/>
-                <w:i/>
-                <w:iCs/>
-                <w:sz w:val="21"/>
-                <w:szCs w:val="21"/>
-              </w:rPr>
-              <w:t xml:space="preserve"> automatiquement (FAC-YYYY-NNNN) et </w:t>
-            </w:r>
-            <w:proofErr w:type="spellStart"/>
-            <w:r>
-              <w:rPr>
-                <w:rFonts w:ascii="Baskerville" w:hAnsi="Baskerville"/>
-                <w:i/>
-                <w:iCs/>
-                <w:sz w:val="21"/>
-                <w:szCs w:val="21"/>
-              </w:rPr>
-              <w:t>archivee</w:t>
-            </w:r>
-            <w:proofErr w:type="spellEnd"/>
+            <w:r>
+              <w:rPr>
+                <w:rFonts w:ascii="Baskerville" w:hAnsi="Baskerville"/>
+                <w:i/>
+                <w:iCs/>
+                <w:sz w:val="21"/>
+                <w:szCs w:val="21"/>
+              </w:rPr>
+              <w:t>données</w:t>
+            </w:r>
+            <w:r>
+              <w:rPr>
+                <w:rFonts w:ascii="Baskerville" w:hAnsi="Baskerville"/>
+                <w:i/>
+                <w:iCs/>
+                <w:sz w:val="21"/>
+                <w:szCs w:val="21"/>
+              </w:rPr>
+              <w:t xml:space="preserve"> de la commande</w:t>
+            </w:r>
+            <w:r>
+              <w:rPr>
+                <w:rFonts w:ascii="Baskerville" w:hAnsi="Baskerville"/>
+                <w:i/>
+                <w:iCs/>
+                <w:sz w:val="21"/>
+                <w:szCs w:val="21"/>
+              </w:rPr>
+              <w:t> </w:t>
+            </w:r>
+            <w:r>
+              <w:rPr>
+                <w:rFonts w:ascii="Baskerville" w:hAnsi="Baskerville"/>
+                <w:i/>
+                <w:iCs/>
+                <w:sz w:val="21"/>
+                <w:szCs w:val="21"/>
+              </w:rPr>
+              <w:t xml:space="preserve">client, articles, </w:t>
+            </w:r>
+            <w:r>
+              <w:rPr>
+                <w:rFonts w:ascii="Baskerville" w:hAnsi="Baskerville"/>
+                <w:i/>
+                <w:iCs/>
+                <w:sz w:val="21"/>
+                <w:szCs w:val="21"/>
+              </w:rPr>
+              <w:t>quantités</w:t>
+            </w:r>
+            <w:r>
+              <w:rPr>
+                <w:rFonts w:ascii="Baskerville" w:hAnsi="Baskerville"/>
+                <w:i/>
+                <w:iCs/>
+                <w:sz w:val="21"/>
+                <w:szCs w:val="21"/>
+              </w:rPr>
+              <w:t>, prix. Plus de ressaisie, plus d</w:t>
+            </w:r>
+            <w:r>
+              <w:rPr>
+                <w:rFonts w:ascii="Baskerville" w:hAnsi="Baskerville"/>
+                <w:i/>
+                <w:iCs/>
+                <w:sz w:val="21"/>
+                <w:szCs w:val="21"/>
+              </w:rPr>
+              <w:t>’</w:t>
+            </w:r>
+            <w:r>
+              <w:rPr>
+                <w:rFonts w:ascii="Baskerville" w:hAnsi="Baskerville"/>
+                <w:i/>
+                <w:iCs/>
+                <w:sz w:val="21"/>
+                <w:szCs w:val="21"/>
+              </w:rPr>
+              <w:t xml:space="preserve">erreurs. La facture est </w:t>
+            </w:r>
+            <w:r>
+              <w:rPr>
+                <w:rFonts w:ascii="Baskerville" w:hAnsi="Baskerville"/>
+                <w:i/>
+                <w:iCs/>
+                <w:sz w:val="21"/>
+                <w:szCs w:val="21"/>
+              </w:rPr>
+              <w:t>numérotée</w:t>
+            </w:r>
+            <w:r>
+              <w:rPr>
+                <w:rFonts w:ascii="Baskerville" w:hAnsi="Baskerville"/>
+                <w:i/>
+                <w:iCs/>
+                <w:sz w:val="21"/>
+                <w:szCs w:val="21"/>
+              </w:rPr>
+              <w:t xml:space="preserve"> automatiquement (FAC-YYYY-</w:t>
+            </w:r>
+            <w:r>
+              <w:rPr>
+                <w:rFonts w:ascii="Baskerville" w:hAnsi="Baskerville"/>
+                <w:i/>
+                <w:iCs/>
+                <w:sz w:val="21"/>
+                <w:szCs w:val="21"/>
+              </w:rPr>
+              <w:t>XXXX</w:t>
+            </w:r>
+            <w:r>
+              <w:rPr>
+                <w:rFonts w:ascii="Baskerville" w:hAnsi="Baskerville"/>
+                <w:i/>
+                <w:iCs/>
+                <w:sz w:val="21"/>
+                <w:szCs w:val="21"/>
+              </w:rPr>
+              <w:t xml:space="preserve">) et </w:t>
+            </w:r>
+            <w:r>
+              <w:rPr>
+                <w:rFonts w:ascii="Baskerville" w:hAnsi="Baskerville"/>
+                <w:i/>
+                <w:iCs/>
+                <w:sz w:val="21"/>
+                <w:szCs w:val="21"/>
+              </w:rPr>
+              <w:t>archivée</w:t>
+            </w:r>
             <w:r>
               <w:rPr>
                 <w:rFonts w:ascii="Baskerville" w:hAnsi="Baskerville"/>
@@ -17602,34 +17030,14 @@
           <w:szCs w:val="24"/>
         </w:rPr>
       </w:pPr>
-      <w:proofErr w:type="spellStart"/>
       <w:r>
         <w:rPr>
           <w:rFonts w:ascii="Baskerville" w:hAnsi="Baskerville"/>
           <w:sz w:val="24"/>
           <w:szCs w:val="24"/>
         </w:rPr>
-        <w:t>Fonctionnalites</w:t>
-      </w:r>
-      <w:proofErr w:type="spellEnd"/>
-      <w:r>
-        <w:rPr>
-          <w:rFonts w:ascii="Baskerville" w:hAnsi="Baskerville"/>
-          <w:sz w:val="24"/>
-          <w:szCs w:val="24"/>
-        </w:rPr>
-        <w:t xml:space="preserve"> </w:t>
-      </w:r>
-      <w:proofErr w:type="spellStart"/>
-      <w:r>
-        <w:rPr>
-          <w:rFonts w:ascii="Baskerville" w:hAnsi="Baskerville"/>
-          <w:sz w:val="24"/>
-          <w:szCs w:val="24"/>
-        </w:rPr>
-        <w:t>cles</w:t>
-      </w:r>
-      <w:proofErr w:type="spellEnd"/>
+        <w:t>Fonctionnalités clés</w:t>
+      </w:r>
     </w:p>
     <w:p>
       <w:pPr>
@@ -17645,23 +17053,13 @@
           <w:szCs w:val="22"/>
         </w:rPr>
       </w:pPr>
-      <w:proofErr w:type="spellStart"/>
-      <w:r>
-        <w:rPr>
-          <w:rFonts w:ascii="Baskerville" w:hAnsi="Baskerville"/>
-          <w:sz w:val="22"/>
-          <w:szCs w:val="22"/>
-        </w:rPr>
-        <w:t>Generation</w:t>
-      </w:r>
-      <w:proofErr w:type="spellEnd"/>
-      <w:r>
-        <w:rPr>
-          <w:rFonts w:ascii="Baskerville" w:hAnsi="Baskerville"/>
-          <w:sz w:val="22"/>
-          <w:szCs w:val="22"/>
-        </w:rPr>
-        <w:t xml:space="preserve"> automatique depuis la commande client (0 ressaisie)</w:t>
+      <w:r>
+        <w:rPr>
+          <w:rFonts w:ascii="Baskerville" w:hAnsi="Baskerville"/>
+          <w:sz w:val="22"/>
+          <w:szCs w:val="22"/>
+        </w:rPr>
+        <w:t>Génération automatique depuis la commande client (0 ressaisie)</w:t>
       </w:r>
     </w:p>
     <w:p>
@@ -17678,23 +17076,21 @@
           <w:szCs w:val="22"/>
         </w:rPr>
       </w:pPr>
-      <w:proofErr w:type="spellStart"/>
-      <w:r>
-        <w:rPr>
-          <w:rFonts w:ascii="Baskerville" w:hAnsi="Baskerville"/>
-          <w:sz w:val="22"/>
-          <w:szCs w:val="22"/>
-        </w:rPr>
-        <w:t>Numerotation</w:t>
-      </w:r>
-      <w:proofErr w:type="spellEnd"/>
-      <w:r>
-        <w:rPr>
-          <w:rFonts w:ascii="Baskerville" w:hAnsi="Baskerville"/>
-          <w:sz w:val="22"/>
-          <w:szCs w:val="22"/>
-        </w:rPr>
-        <w:t xml:space="preserve"> automatique : FAC-YYYY-NNNN</w:t>
+      <w:r>
+        <w:rPr>
+          <w:rFonts w:ascii="Baskerville" w:hAnsi="Baskerville"/>
+          <w:sz w:val="22"/>
+          <w:szCs w:val="22"/>
+        </w:rPr>
+        <w:t>Numérotation automatique : FAC-YYYY-</w:t>
+      </w:r>
+      <w:r>
+        <w:rPr>
+          <w:rFonts w:ascii="Baskerville" w:hAnsi="Baskerville"/>
+          <w:sz w:val="22"/>
+          <w:szCs w:val="22"/>
+        </w:rPr>
+        <w:t>XXXX</w:t>
       </w:r>
     </w:p>
     <w:p>
@@ -17717,7 +17113,7 @@
           <w:sz w:val="22"/>
           <w:szCs w:val="22"/>
         </w:rPr>
-        <w:t>Calcul automatique HT, TVA (18%) et TTC</w:t>
+        <w:t>Calcul automatique HT, TVA et TTC</w:t>
       </w:r>
     </w:p>
     <w:p>
@@ -17734,59 +17130,29 @@
           <w:szCs w:val="22"/>
         </w:rPr>
       </w:pPr>
-      <w:proofErr w:type="spellStart"/>
-      <w:r>
-        <w:rPr>
-          <w:rFonts w:ascii="Baskerville" w:hAnsi="Baskerville"/>
-          <w:sz w:val="22"/>
-          <w:szCs w:val="22"/>
-        </w:rPr>
-        <w:t>Echeance</w:t>
-      </w:r>
-      <w:proofErr w:type="spellEnd"/>
-      <w:r>
-        <w:rPr>
-          <w:rFonts w:ascii="Baskerville" w:hAnsi="Baskerville"/>
-          <w:sz w:val="22"/>
-          <w:szCs w:val="22"/>
-        </w:rPr>
-        <w:t xml:space="preserve"> </w:t>
-      </w:r>
-      <w:proofErr w:type="spellStart"/>
-      <w:r>
-        <w:rPr>
-          <w:rFonts w:ascii="Baskerville" w:hAnsi="Baskerville"/>
-          <w:sz w:val="22"/>
-          <w:szCs w:val="22"/>
-        </w:rPr>
-        <w:t>a</w:t>
-      </w:r>
-      <w:proofErr w:type="spellEnd"/>
-      <w:r>
-        <w:rPr>
-          <w:rFonts w:ascii="Baskerville" w:hAnsi="Baskerville"/>
-          <w:sz w:val="22"/>
-          <w:szCs w:val="22"/>
-        </w:rPr>
-        <w:t xml:space="preserve"> J+30 par </w:t>
-      </w:r>
-      <w:proofErr w:type="spellStart"/>
-      <w:r>
-        <w:rPr>
-          <w:rFonts w:ascii="Baskerville" w:hAnsi="Baskerville"/>
-          <w:sz w:val="22"/>
-          <w:szCs w:val="22"/>
-        </w:rPr>
-        <w:t>defaut</w:t>
-      </w:r>
-      <w:proofErr w:type="spellEnd"/>
-      <w:r>
-        <w:rPr>
-          <w:rFonts w:ascii="Baskerville" w:hAnsi="Baskerville"/>
-          <w:sz w:val="22"/>
-          <w:szCs w:val="22"/>
-        </w:rPr>
-        <w:t>, personnalisable</w:t>
+      <w:r>
+        <w:rPr>
+          <w:rFonts w:ascii="Baskerville" w:hAnsi="Baskerville"/>
+          <w:sz w:val="22"/>
+          <w:szCs w:val="22"/>
+        </w:rPr>
+        <w:t xml:space="preserve">Échéance </w:t>
+      </w:r>
+      <w:r>
+        <w:rPr>
+          <w:rFonts w:ascii="Baskerville" w:hAnsi="Baskerville"/>
+          <w:sz w:val="22"/>
+          <w:szCs w:val="22"/>
+        </w:rPr>
+        <w:t>à</w:t>
+      </w:r>
+      <w:r>
+        <w:rPr>
+          <w:rFonts w:ascii="Baskerville" w:hAnsi="Baskerville"/>
+          <w:sz w:val="22"/>
+          <w:szCs w:val="22"/>
+        </w:rPr>
+        <w:t xml:space="preserve"> J+30 par défaut, personnalisable</w:t>
       </w:r>
     </w:p>
     <w:p>
@@ -17827,16 +17193,14 @@
         </w:rPr>
         <w:t xml:space="preserve"> </w:t>
       </w:r>
-      <w:proofErr w:type="spellStart"/>
-      <w:r>
-        <w:rPr>
-          <w:rFonts w:ascii="Baskerville" w:hAnsi="Baskerville"/>
-          <w:sz w:val="22"/>
-          <w:szCs w:val="22"/>
-        </w:rPr>
-        <w:t>Emise</w:t>
-      </w:r>
-      <w:proofErr w:type="spellEnd"/>
+      <w:r>
+        <w:rPr>
+          <w:rFonts w:ascii="Baskerville" w:hAnsi="Baskerville"/>
+          <w:sz w:val="22"/>
+          <w:szCs w:val="22"/>
+        </w:rPr>
+        <w:t>Émise</w:t>
+      </w:r>
       <w:r>
         <w:rPr>
           <w:rFonts w:ascii="Baskerville" w:hAnsi="Baskerville"/>
@@ -17861,16 +17225,14 @@
         </w:rPr>
         <w:t xml:space="preserve"> </w:t>
       </w:r>
-      <w:proofErr w:type="spellStart"/>
-      <w:r>
-        <w:rPr>
-          <w:rFonts w:ascii="Baskerville" w:hAnsi="Baskerville"/>
-          <w:sz w:val="22"/>
-          <w:szCs w:val="22"/>
-        </w:rPr>
-        <w:t>Payee</w:t>
-      </w:r>
-      <w:proofErr w:type="spellEnd"/>
+      <w:r>
+        <w:rPr>
+          <w:rFonts w:ascii="Baskerville" w:hAnsi="Baskerville"/>
+          <w:sz w:val="22"/>
+          <w:szCs w:val="22"/>
+        </w:rPr>
+        <w:t>Payée</w:t>
+      </w:r>
       <w:r>
         <w:rPr>
           <w:rFonts w:ascii="Baskerville" w:hAnsi="Baskerville"/>
@@ -17895,16 +17257,14 @@
         </w:rPr>
         <w:t xml:space="preserve"> </w:t>
       </w:r>
-      <w:proofErr w:type="spellStart"/>
-      <w:r>
-        <w:rPr>
-          <w:rFonts w:ascii="Baskerville" w:hAnsi="Baskerville"/>
-          <w:sz w:val="22"/>
-          <w:szCs w:val="22"/>
-        </w:rPr>
-        <w:t>Annulee</w:t>
-      </w:r>
-      <w:proofErr w:type="spellEnd"/>
+      <w:r>
+        <w:rPr>
+          <w:rFonts w:ascii="Baskerville" w:hAnsi="Baskerville"/>
+          <w:sz w:val="22"/>
+          <w:szCs w:val="22"/>
+        </w:rPr>
+        <w:t>Annulée</w:t>
+      </w:r>
     </w:p>
     <w:p>
       <w:pPr>
@@ -17920,7 +17280,6 @@
           <w:szCs w:val="22"/>
         </w:rPr>
       </w:pPr>
-      <w:proofErr w:type="spellStart"/>
       <w:r>
         <w:rPr>
           <w:rFonts w:ascii="Baskerville" w:hAnsi="Baskerville"/>
@@ -17928,16 +17287,39 @@
           <w:szCs w:val="22"/>
         </w:rPr>
         <w:lastRenderedPageBreak/>
-        <w:t>Acces</w:t>
-      </w:r>
-      <w:proofErr w:type="spellEnd"/>
-      <w:r>
-        <w:rPr>
-          <w:rFonts w:ascii="Baskerville" w:hAnsi="Baskerville"/>
-          <w:sz w:val="22"/>
-          <w:szCs w:val="22"/>
-        </w:rPr>
-        <w:t xml:space="preserve"> a l'historique de toutes les factures par client</w:t>
+        <w:t xml:space="preserve">Accès </w:t>
+      </w:r>
+      <w:r>
+        <w:rPr>
+          <w:rFonts w:ascii="Baskerville" w:hAnsi="Baskerville"/>
+          <w:sz w:val="22"/>
+          <w:szCs w:val="22"/>
+        </w:rPr>
+        <w:t>à</w:t>
+      </w:r>
+      <w:r>
+        <w:rPr>
+          <w:rFonts w:ascii="Baskerville" w:hAnsi="Baskerville"/>
+          <w:sz w:val="22"/>
+          <w:szCs w:val="22"/>
+        </w:rPr>
+        <w:t xml:space="preserve"> l</w:t>
+      </w:r>
+      <w:r>
+        <w:rPr>
+          <w:rFonts w:ascii="Baskerville" w:hAnsi="Baskerville"/>
+          <w:sz w:val="22"/>
+          <w:szCs w:val="22"/>
+        </w:rPr>
+        <w:t>’</w:t>
+      </w:r>
+      <w:r>
+        <w:rPr>
+          <w:rFonts w:ascii="Baskerville" w:hAnsi="Baskerville"/>
+          <w:sz w:val="22"/>
+          <w:szCs w:val="22"/>
+        </w:rPr>
+        <w:t>historique de toutes les factures par client</w:t>
       </w:r>
     </w:p>
     <w:p>
@@ -18027,17 +17409,15 @@
               </w:rPr>
               <w:t xml:space="preserve">La commande Auchan de 4 800 bouteilles est </w:t>
             </w:r>
-            <w:proofErr w:type="spellStart"/>
-            <w:r>
-              <w:rPr>
-                <w:rFonts w:ascii="Baskerville" w:hAnsi="Baskerville"/>
-                <w:color w:val="065F46"/>
-                <w:sz w:val="21"/>
-                <w:szCs w:val="21"/>
-              </w:rPr>
-              <w:t>livree</w:t>
-            </w:r>
-            <w:proofErr w:type="spellEnd"/>
+            <w:r>
+              <w:rPr>
+                <w:rFonts w:ascii="Baskerville" w:hAnsi="Baskerville"/>
+                <w:color w:val="065F46"/>
+                <w:sz w:val="21"/>
+                <w:szCs w:val="21"/>
+              </w:rPr>
+              <w:t>livrée</w:t>
+            </w:r>
             <w:r>
               <w:rPr>
                 <w:rFonts w:ascii="Baskerville" w:hAnsi="Baskerville"/>
@@ -18047,17 +17427,15 @@
               </w:rPr>
               <w:t>. En un clic sur "</w:t>
             </w:r>
-            <w:proofErr w:type="spellStart"/>
-            <w:r>
-              <w:rPr>
-                <w:rFonts w:ascii="Baskerville" w:hAnsi="Baskerville"/>
-                <w:color w:val="065F46"/>
-                <w:sz w:val="21"/>
-                <w:szCs w:val="21"/>
-              </w:rPr>
-              <w:t>Generer</w:t>
-            </w:r>
-            <w:proofErr w:type="spellEnd"/>
+            <w:r>
+              <w:rPr>
+                <w:rFonts w:ascii="Baskerville" w:hAnsi="Baskerville"/>
+                <w:color w:val="065F46"/>
+                <w:sz w:val="21"/>
+                <w:szCs w:val="21"/>
+              </w:rPr>
+              <w:t>Générer</w:t>
+            </w:r>
             <w:r>
               <w:rPr>
                 <w:rFonts w:ascii="Baskerville" w:hAnsi="Baskerville"/>
@@ -18067,17 +17445,15 @@
               </w:rPr>
               <w:t xml:space="preserve"> la facture", Bluwa </w:t>
             </w:r>
-            <w:proofErr w:type="spellStart"/>
-            <w:r>
-              <w:rPr>
-                <w:rFonts w:ascii="Baskerville" w:hAnsi="Baskerville"/>
-                <w:color w:val="065F46"/>
-                <w:sz w:val="21"/>
-                <w:szCs w:val="21"/>
-              </w:rPr>
-              <w:t>cree</w:t>
-            </w:r>
-            <w:proofErr w:type="spellEnd"/>
+            <w:r>
+              <w:rPr>
+                <w:rFonts w:ascii="Baskerville" w:hAnsi="Baskerville"/>
+                <w:color w:val="065F46"/>
+                <w:sz w:val="21"/>
+                <w:szCs w:val="21"/>
+              </w:rPr>
+              <w:t>crée</w:t>
+            </w:r>
             <w:r>
               <w:rPr>
                 <w:rFonts w:ascii="Baskerville" w:hAnsi="Baskerville"/>
@@ -18087,17 +17463,15 @@
               </w:rPr>
               <w:t xml:space="preserve"> la facture FAC-2026-0042 : 4 800 x 450 FCFA = 2 160 000 FCFA HT, TVA 18% = 388 800 FCFA, Total TTC = 2 548 800 FCFA, </w:t>
             </w:r>
-            <w:proofErr w:type="spellStart"/>
-            <w:r>
-              <w:rPr>
-                <w:rFonts w:ascii="Baskerville" w:hAnsi="Baskerville"/>
-                <w:color w:val="065F46"/>
-                <w:sz w:val="21"/>
-                <w:szCs w:val="21"/>
-              </w:rPr>
-              <w:t>echeance</w:t>
-            </w:r>
-            <w:proofErr w:type="spellEnd"/>
+            <w:r>
+              <w:rPr>
+                <w:rFonts w:ascii="Baskerville" w:hAnsi="Baskerville"/>
+                <w:color w:val="065F46"/>
+                <w:sz w:val="21"/>
+                <w:szCs w:val="21"/>
+              </w:rPr>
+              <w:t>échéance</w:t>
+            </w:r>
             <w:r>
               <w:rPr>
                 <w:rFonts w:ascii="Baskerville" w:hAnsi="Baskerville"/>
@@ -25095,43 +24469,7 @@
           <w:color w:val="6B7280"/>
           <w:lang w:val="en-US"/>
         </w:rPr>
-        <w:t xml:space="preserve">Bluwa </w:t>
-      </w:r>
-      <w:proofErr w:type="gramStart"/>
-      <w:r>
-        <w:rPr>
-          <w:rFonts w:ascii="Baskerville" w:hAnsi="Baskerville"/>
-          <w:color w:val="6B7280"/>
-          <w:lang w:val="en-US"/>
-        </w:rPr>
-        <w:t>ERP  ·</w:t>
-      </w:r>
-      <w:proofErr w:type="gramEnd"/>
-      <w:r>
-        <w:rPr>
-          <w:rFonts w:ascii="Baskerville" w:hAnsi="Baskerville"/>
-          <w:color w:val="6B7280"/>
-          <w:lang w:val="en-US"/>
-        </w:rPr>
-        <w:t xml:space="preserve">  </w:t>
-      </w:r>
-      <w:proofErr w:type="gramStart"/>
-      <w:r>
-        <w:rPr>
-          <w:rFonts w:ascii="Baskerville" w:hAnsi="Baskerville"/>
-          <w:color w:val="6B7280"/>
-          <w:lang w:val="en-US"/>
-        </w:rPr>
-        <w:t>contact@bluwa.io  ·</w:t>
-      </w:r>
-      <w:proofErr w:type="gramEnd"/>
-      <w:r>
-        <w:rPr>
-          <w:rFonts w:ascii="Baskerville" w:hAnsi="Baskerville"/>
-          <w:color w:val="6B7280"/>
-          <w:lang w:val="en-US"/>
-        </w:rPr>
-        <w:t xml:space="preserve">  www.bluwa.io</w:t>
+        <w:t>Bluwa ERP  ·  contact@bluwa.io  ·  www.bluwa.io</w:t>
       </w:r>
     </w:p>
     <w:sectPr>
@@ -25192,31 +24530,7 @@
         <w:sz w:val="17"/>
         <w:szCs w:val="17"/>
       </w:rPr>
-      <w:t xml:space="preserve"> </w:t>
-    </w:r>
-    <w:r>
-      <w:rPr>
-        <w:color w:val="6B7280"/>
-        <w:sz w:val="17"/>
-        <w:szCs w:val="17"/>
-      </w:rPr>
-      <w:t xml:space="preserve"> </w:t>
-    </w:r>
-    <w:r>
-      <w:rPr>
-        <w:color w:val="6B7280"/>
-        <w:sz w:val="17"/>
-        <w:szCs w:val="17"/>
-      </w:rPr>
-      <w:t>john</w:t>
-    </w:r>
-    <w:r>
-      <w:rPr>
-        <w:color w:val="6B7280"/>
-        <w:sz w:val="17"/>
-        <w:szCs w:val="17"/>
-      </w:rPr>
-      <w:t>@bluwa.io</w:t>
+      <w:t xml:space="preserve">  john@bluwa.io</w:t>
     </w:r>
     <w:r>
       <w:rPr>

</xml_diff>

<commit_message>
docs: mise à jour guide modules ERP
Co-Authored-By: Claude Sonnet 4.6 <noreply@anthropic.com>
</commit_message>
<xml_diff>
--- a/docs/bluwa_erp_guide_modules.docx
+++ b/docs/bluwa_erp_guide_modules.docx
@@ -10431,7 +10431,29 @@
                 <w:sz w:val="21"/>
                 <w:szCs w:val="21"/>
               </w:rPr>
-              <w:t>Exemple concret — Afrique de l'Ouest</w:t>
+              <w:t>Exemple concret — Afrique de l</w:t>
+            </w:r>
+            <w:r>
+              <w:rPr>
+                <w:rFonts w:ascii="Baskerville" w:hAnsi="Baskerville"/>
+                <w:b/>
+                <w:bCs/>
+                <w:color w:val="065F46"/>
+                <w:sz w:val="21"/>
+                <w:szCs w:val="21"/>
+              </w:rPr>
+              <w:t>’</w:t>
+            </w:r>
+            <w:r>
+              <w:rPr>
+                <w:rFonts w:ascii="Baskerville" w:hAnsi="Baskerville"/>
+                <w:b/>
+                <w:bCs/>
+                <w:color w:val="065F46"/>
+                <w:sz w:val="21"/>
+                <w:szCs w:val="21"/>
+              </w:rPr>
+              <w:t>Ouest</w:t>
             </w:r>
           </w:p>
           <w:p>
@@ -17389,7 +17411,29 @@
                 <w:sz w:val="21"/>
                 <w:szCs w:val="21"/>
               </w:rPr>
-              <w:t>Exemple concret — Afrique de l'Ouest</w:t>
+              <w:t>Exemple concret — Afrique de l</w:t>
+            </w:r>
+            <w:r>
+              <w:rPr>
+                <w:rFonts w:ascii="Baskerville" w:hAnsi="Baskerville"/>
+                <w:b/>
+                <w:bCs/>
+                <w:color w:val="065F46"/>
+                <w:sz w:val="21"/>
+                <w:szCs w:val="21"/>
+              </w:rPr>
+              <w:t>’</w:t>
+            </w:r>
+            <w:r>
+              <w:rPr>
+                <w:rFonts w:ascii="Baskerville" w:hAnsi="Baskerville"/>
+                <w:b/>
+                <w:bCs/>
+                <w:color w:val="065F46"/>
+                <w:sz w:val="21"/>
+                <w:szCs w:val="21"/>
+              </w:rPr>
+              <w:t>Ouest</w:t>
             </w:r>
           </w:p>
           <w:p>
@@ -18239,52 +18283,54 @@
         <w:lastRenderedPageBreak/>
         <w:t xml:space="preserve">7. Assurance </w:t>
       </w:r>
-      <w:proofErr w:type="spellStart"/>
       <w:r>
         <w:rPr>
           <w:rFonts w:ascii="Baskerville" w:hAnsi="Baskerville"/>
           <w:sz w:val="32"/>
           <w:szCs w:val="32"/>
         </w:rPr>
-        <w:t>Qualite</w:t>
-      </w:r>
-      <w:proofErr w:type="spellEnd"/>
+        <w:t>Qualité</w:t>
+      </w:r>
       <w:r>
         <w:rPr>
           <w:rFonts w:ascii="Baskerville" w:hAnsi="Baskerville"/>
           <w:sz w:val="32"/>
           <w:szCs w:val="32"/>
         </w:rPr>
-        <w:t xml:space="preserve"> — Garantir la </w:t>
-      </w:r>
-      <w:proofErr w:type="spellStart"/>
+        <w:t xml:space="preserve"> : </w:t>
+      </w:r>
       <w:r>
         <w:rPr>
           <w:rFonts w:ascii="Baskerville" w:hAnsi="Baskerville"/>
           <w:sz w:val="32"/>
           <w:szCs w:val="32"/>
         </w:rPr>
-        <w:t>securite</w:t>
-      </w:r>
-      <w:proofErr w:type="spellEnd"/>
+        <w:t xml:space="preserve">Garantir la </w:t>
+      </w:r>
       <w:r>
         <w:rPr>
           <w:rFonts w:ascii="Baskerville" w:hAnsi="Baskerville"/>
           <w:sz w:val="32"/>
           <w:szCs w:val="32"/>
         </w:rPr>
-        <w:t xml:space="preserve"> et la </w:t>
-      </w:r>
-      <w:proofErr w:type="spellStart"/>
+        <w:t>sécurité</w:t>
+      </w:r>
       <w:r>
         <w:rPr>
           <w:rFonts w:ascii="Baskerville" w:hAnsi="Baskerville"/>
           <w:sz w:val="32"/>
           <w:szCs w:val="32"/>
         </w:rPr>
-        <w:t>conformite</w:t>
-      </w:r>
-      <w:proofErr w:type="spellEnd"/>
+        <w:t xml:space="preserve"> et la </w:t>
+      </w:r>
+      <w:r>
+        <w:rPr>
+          <w:rFonts w:ascii="Baskerville" w:hAnsi="Baskerville"/>
+          <w:sz w:val="32"/>
+          <w:szCs w:val="32"/>
+        </w:rPr>
+        <w:t>conformité</w:t>
+      </w:r>
     </w:p>
     <w:p>
       <w:pPr>
@@ -18303,34 +18349,78 @@
         </w:rPr>
         <w:t xml:space="preserve">En agroalimentaire, la </w:t>
       </w:r>
-      <w:proofErr w:type="spellStart"/>
-      <w:r>
-        <w:rPr>
-          <w:rFonts w:ascii="Baskerville" w:hAnsi="Baskerville"/>
-          <w:sz w:val="22"/>
-          <w:szCs w:val="22"/>
-        </w:rPr>
-        <w:t>qualite</w:t>
-      </w:r>
-      <w:proofErr w:type="spellEnd"/>
-      <w:r>
-        <w:rPr>
-          <w:rFonts w:ascii="Baskerville" w:hAnsi="Baskerville"/>
-          <w:sz w:val="22"/>
-          <w:szCs w:val="22"/>
-        </w:rPr>
-        <w:t xml:space="preserve"> n'est pas une option — c'est une obligation </w:t>
-      </w:r>
-      <w:proofErr w:type="spellStart"/>
-      <w:r>
-        <w:rPr>
-          <w:rFonts w:ascii="Baskerville" w:hAnsi="Baskerville"/>
-          <w:sz w:val="22"/>
-          <w:szCs w:val="22"/>
-        </w:rPr>
-        <w:t>legale</w:t>
-      </w:r>
-      <w:proofErr w:type="spellEnd"/>
+      <w:r>
+        <w:rPr>
+          <w:rFonts w:ascii="Baskerville" w:hAnsi="Baskerville"/>
+          <w:sz w:val="22"/>
+          <w:szCs w:val="22"/>
+        </w:rPr>
+        <w:t>qualité</w:t>
+      </w:r>
+      <w:r>
+        <w:rPr>
+          <w:rFonts w:ascii="Baskerville" w:hAnsi="Baskerville"/>
+          <w:sz w:val="22"/>
+          <w:szCs w:val="22"/>
+        </w:rPr>
+        <w:t xml:space="preserve"> n</w:t>
+      </w:r>
+      <w:r>
+        <w:rPr>
+          <w:rFonts w:ascii="Baskerville" w:hAnsi="Baskerville"/>
+          <w:sz w:val="22"/>
+          <w:szCs w:val="22"/>
+        </w:rPr>
+        <w:t>’</w:t>
+      </w:r>
+      <w:r>
+        <w:rPr>
+          <w:rFonts w:ascii="Baskerville" w:hAnsi="Baskerville"/>
+          <w:sz w:val="22"/>
+          <w:szCs w:val="22"/>
+        </w:rPr>
+        <w:t>est pas une option</w:t>
+      </w:r>
+      <w:r>
+        <w:rPr>
+          <w:rFonts w:ascii="Baskerville" w:hAnsi="Baskerville"/>
+          <w:sz w:val="22"/>
+          <w:szCs w:val="22"/>
+        </w:rPr>
+        <w:t xml:space="preserve">, </w:t>
+      </w:r>
+      <w:r>
+        <w:rPr>
+          <w:rFonts w:ascii="Baskerville" w:hAnsi="Baskerville"/>
+          <w:sz w:val="22"/>
+          <w:szCs w:val="22"/>
+        </w:rPr>
+        <w:t>c</w:t>
+      </w:r>
+      <w:r>
+        <w:rPr>
+          <w:rFonts w:ascii="Baskerville" w:hAnsi="Baskerville"/>
+          <w:sz w:val="22"/>
+          <w:szCs w:val="22"/>
+        </w:rPr>
+        <w:t>’</w:t>
+      </w:r>
+      <w:r>
+        <w:rPr>
+          <w:rFonts w:ascii="Baskerville" w:hAnsi="Baskerville"/>
+          <w:sz w:val="22"/>
+          <w:szCs w:val="22"/>
+        </w:rPr>
+        <w:t xml:space="preserve">est une obligation </w:t>
+      </w:r>
+      <w:r>
+        <w:rPr>
+          <w:rFonts w:ascii="Baskerville" w:hAnsi="Baskerville"/>
+          <w:sz w:val="22"/>
+          <w:szCs w:val="22"/>
+        </w:rPr>
+        <w:t>légale</w:t>
+      </w:r>
       <w:r>
         <w:rPr>
           <w:rFonts w:ascii="Baskerville" w:hAnsi="Baskerville"/>
@@ -18339,16 +18429,14 @@
         </w:rPr>
         <w:t xml:space="preserve"> et commerciale. Ce module assure que rien ne part en production ou chez un client sans avoir </w:t>
       </w:r>
-      <w:proofErr w:type="spellStart"/>
-      <w:r>
-        <w:rPr>
-          <w:rFonts w:ascii="Baskerville" w:hAnsi="Baskerville"/>
-          <w:sz w:val="22"/>
-          <w:szCs w:val="22"/>
-        </w:rPr>
-        <w:t>ete</w:t>
-      </w:r>
-      <w:proofErr w:type="spellEnd"/>
+      <w:r>
+        <w:rPr>
+          <w:rFonts w:ascii="Baskerville" w:hAnsi="Baskerville"/>
+          <w:sz w:val="22"/>
+          <w:szCs w:val="22"/>
+        </w:rPr>
+        <w:t>été</w:t>
+      </w:r>
       <w:r>
         <w:rPr>
           <w:rFonts w:ascii="Baskerville" w:hAnsi="Baskerville"/>
@@ -18357,16 +18445,14 @@
         </w:rPr>
         <w:t xml:space="preserve"> valide. Il constitue </w:t>
       </w:r>
-      <w:proofErr w:type="spellStart"/>
-      <w:r>
-        <w:rPr>
-          <w:rFonts w:ascii="Baskerville" w:hAnsi="Baskerville"/>
-          <w:sz w:val="22"/>
-          <w:szCs w:val="22"/>
-        </w:rPr>
-        <w:t>egalement</w:t>
-      </w:r>
-      <w:proofErr w:type="spellEnd"/>
+      <w:r>
+        <w:rPr>
+          <w:rFonts w:ascii="Baskerville" w:hAnsi="Baskerville"/>
+          <w:sz w:val="22"/>
+          <w:szCs w:val="22"/>
+        </w:rPr>
+        <w:t>également</w:t>
+      </w:r>
       <w:r>
         <w:rPr>
           <w:rFonts w:ascii="Baskerville" w:hAnsi="Baskerville"/>
@@ -18375,16 +18461,14 @@
         </w:rPr>
         <w:t xml:space="preserve"> toute la documentation </w:t>
       </w:r>
-      <w:proofErr w:type="spellStart"/>
-      <w:r>
-        <w:rPr>
-          <w:rFonts w:ascii="Baskerville" w:hAnsi="Baskerville"/>
-          <w:sz w:val="22"/>
-          <w:szCs w:val="22"/>
-        </w:rPr>
-        <w:t>necessaire</w:t>
-      </w:r>
-      <w:proofErr w:type="spellEnd"/>
+      <w:r>
+        <w:rPr>
+          <w:rFonts w:ascii="Baskerville" w:hAnsi="Baskerville"/>
+          <w:sz w:val="22"/>
+          <w:szCs w:val="22"/>
+        </w:rPr>
+        <w:t>nécessaire</w:t>
+      </w:r>
       <w:r>
         <w:rPr>
           <w:rFonts w:ascii="Baskerville" w:hAnsi="Baskerville"/>
@@ -18411,16 +18495,14 @@
         </w:rPr>
         <w:t xml:space="preserve">Centre de </w:t>
       </w:r>
-      <w:proofErr w:type="spellStart"/>
       <w:r>
         <w:rPr>
           <w:rFonts w:ascii="Baskerville" w:hAnsi="Baskerville"/>
           <w:sz w:val="26"/>
           <w:szCs w:val="26"/>
         </w:rPr>
-        <w:t>liberation</w:t>
-      </w:r>
-      <w:proofErr w:type="spellEnd"/>
+        <w:t>libération</w:t>
+      </w:r>
       <w:r>
         <w:rPr>
           <w:rFonts w:ascii="Baskerville" w:hAnsi="Baskerville"/>
@@ -18461,7 +18543,6 @@
         </w:rPr>
         <w:t xml:space="preserve">Responsable </w:t>
       </w:r>
-      <w:proofErr w:type="spellStart"/>
       <w:r>
         <w:rPr>
           <w:rFonts w:ascii="Baskerville" w:hAnsi="Baskerville"/>
@@ -18471,9 +18552,8 @@
           <w:sz w:val="21"/>
           <w:szCs w:val="21"/>
         </w:rPr>
-        <w:t>qualite</w:t>
-      </w:r>
-      <w:proofErr w:type="spellEnd"/>
+        <w:t>qualité</w:t>
+      </w:r>
       <w:r>
         <w:rPr>
           <w:rFonts w:ascii="Baskerville" w:hAnsi="Baskerville"/>
@@ -18574,18 +18654,16 @@
               </w:rPr>
               <w:t xml:space="preserve">Aucun lot de </w:t>
             </w:r>
-            <w:proofErr w:type="spellStart"/>
-            <w:r>
-              <w:rPr>
-                <w:rFonts w:ascii="Baskerville" w:hAnsi="Baskerville"/>
-                <w:i/>
-                <w:iCs/>
-                <w:sz w:val="21"/>
-                <w:szCs w:val="21"/>
-              </w:rPr>
-              <w:t>matiere</w:t>
-            </w:r>
-            <w:proofErr w:type="spellEnd"/>
+            <w:r>
+              <w:rPr>
+                <w:rFonts w:ascii="Baskerville" w:hAnsi="Baskerville"/>
+                <w:i/>
+                <w:iCs/>
+                <w:sz w:val="21"/>
+                <w:szCs w:val="21"/>
+              </w:rPr>
+              <w:t>matière</w:t>
+            </w:r>
             <w:r>
               <w:rPr>
                 <w:rFonts w:ascii="Baskerville" w:hAnsi="Baskerville"/>
@@ -18596,18 +18674,16 @@
               </w:rPr>
               <w:t xml:space="preserve"> </w:t>
             </w:r>
-            <w:proofErr w:type="spellStart"/>
-            <w:r>
-              <w:rPr>
-                <w:rFonts w:ascii="Baskerville" w:hAnsi="Baskerville"/>
-                <w:i/>
-                <w:iCs/>
-                <w:sz w:val="21"/>
-                <w:szCs w:val="21"/>
-              </w:rPr>
-              <w:t>premiere</w:t>
-            </w:r>
-            <w:proofErr w:type="spellEnd"/>
+            <w:r>
+              <w:rPr>
+                <w:rFonts w:ascii="Baskerville" w:hAnsi="Baskerville"/>
+                <w:i/>
+                <w:iCs/>
+                <w:sz w:val="21"/>
+                <w:szCs w:val="21"/>
+              </w:rPr>
+              <w:t>première</w:t>
+            </w:r>
             <w:r>
               <w:rPr>
                 <w:rFonts w:ascii="Baskerville" w:hAnsi="Baskerville"/>
@@ -18618,18 +18694,16 @@
               </w:rPr>
               <w:t xml:space="preserve"> ou produit fini ne peut </w:t>
             </w:r>
-            <w:proofErr w:type="spellStart"/>
-            <w:r>
-              <w:rPr>
-                <w:rFonts w:ascii="Baskerville" w:hAnsi="Baskerville"/>
-                <w:i/>
-                <w:iCs/>
-                <w:sz w:val="21"/>
-                <w:szCs w:val="21"/>
-              </w:rPr>
-              <w:t>etre</w:t>
-            </w:r>
-            <w:proofErr w:type="spellEnd"/>
+            <w:r>
+              <w:rPr>
+                <w:rFonts w:ascii="Baskerville" w:hAnsi="Baskerville"/>
+                <w:i/>
+                <w:iCs/>
+                <w:sz w:val="21"/>
+                <w:szCs w:val="21"/>
+              </w:rPr>
+              <w:t>être</w:t>
+            </w:r>
             <w:r>
               <w:rPr>
                 <w:rFonts w:ascii="Baskerville" w:hAnsi="Baskerville"/>
@@ -18640,18 +18714,16 @@
               </w:rPr>
               <w:t xml:space="preserve"> utilise en production ou livre a un client sans avoir </w:t>
             </w:r>
-            <w:proofErr w:type="spellStart"/>
-            <w:r>
-              <w:rPr>
-                <w:rFonts w:ascii="Baskerville" w:hAnsi="Baskerville"/>
-                <w:i/>
-                <w:iCs/>
-                <w:sz w:val="21"/>
-                <w:szCs w:val="21"/>
-              </w:rPr>
-              <w:t>recu</w:t>
-            </w:r>
-            <w:proofErr w:type="spellEnd"/>
+            <w:r>
+              <w:rPr>
+                <w:rFonts w:ascii="Baskerville" w:hAnsi="Baskerville"/>
+                <w:i/>
+                <w:iCs/>
+                <w:sz w:val="21"/>
+                <w:szCs w:val="21"/>
+              </w:rPr>
+              <w:t>reçu</w:t>
+            </w:r>
             <w:r>
               <w:rPr>
                 <w:rFonts w:ascii="Baskerville" w:hAnsi="Baskerville"/>
@@ -18662,18 +18734,16 @@
               </w:rPr>
               <w:t xml:space="preserve"> le feu vert du responsable </w:t>
             </w:r>
-            <w:proofErr w:type="spellStart"/>
-            <w:r>
-              <w:rPr>
-                <w:rFonts w:ascii="Baskerville" w:hAnsi="Baskerville"/>
-                <w:i/>
-                <w:iCs/>
-                <w:sz w:val="21"/>
-                <w:szCs w:val="21"/>
-              </w:rPr>
-              <w:t>qualite</w:t>
-            </w:r>
-            <w:proofErr w:type="spellEnd"/>
+            <w:r>
+              <w:rPr>
+                <w:rFonts w:ascii="Baskerville" w:hAnsi="Baskerville"/>
+                <w:i/>
+                <w:iCs/>
+                <w:sz w:val="21"/>
+                <w:szCs w:val="21"/>
+              </w:rPr>
+              <w:t>qualité</w:t>
+            </w:r>
             <w:r>
               <w:rPr>
                 <w:rFonts w:ascii="Baskerville" w:hAnsi="Baskerville"/>
@@ -18684,18 +18754,16 @@
               </w:rPr>
               <w:t xml:space="preserve"> dans Bluwa. Le lot est physiquement </w:t>
             </w:r>
-            <w:proofErr w:type="gramStart"/>
-            <w:r>
-              <w:rPr>
-                <w:rFonts w:ascii="Baskerville" w:hAnsi="Baskerville"/>
-                <w:i/>
-                <w:iCs/>
-                <w:sz w:val="21"/>
-                <w:szCs w:val="21"/>
-              </w:rPr>
-              <w:t>bloque</w:t>
-            </w:r>
-            <w:proofErr w:type="gramEnd"/>
+            <w:r>
+              <w:rPr>
+                <w:rFonts w:ascii="Baskerville" w:hAnsi="Baskerville"/>
+                <w:i/>
+                <w:iCs/>
+                <w:sz w:val="21"/>
+                <w:szCs w:val="21"/>
+              </w:rPr>
+              <w:t>bloqué</w:t>
+            </w:r>
             <w:r>
               <w:rPr>
                 <w:rFonts w:ascii="Baskerville" w:hAnsi="Baskerville"/>
@@ -18706,40 +18774,76 @@
               </w:rPr>
               <w:t xml:space="preserve"> dans le </w:t>
             </w:r>
-            <w:proofErr w:type="spellStart"/>
-            <w:r>
-              <w:rPr>
-                <w:rFonts w:ascii="Baskerville" w:hAnsi="Baskerville"/>
-                <w:i/>
-                <w:iCs/>
-                <w:sz w:val="21"/>
-                <w:szCs w:val="21"/>
-              </w:rPr>
-              <w:t>systeme</w:t>
-            </w:r>
-            <w:proofErr w:type="spellEnd"/>
-            <w:r>
-              <w:rPr>
-                <w:rFonts w:ascii="Baskerville" w:hAnsi="Baskerville"/>
-                <w:i/>
-                <w:iCs/>
-                <w:sz w:val="21"/>
-                <w:szCs w:val="21"/>
-              </w:rPr>
-              <w:t xml:space="preserve"> tant qu'il n'est pas </w:t>
-            </w:r>
-            <w:proofErr w:type="spellStart"/>
-            <w:r>
-              <w:rPr>
-                <w:rFonts w:ascii="Baskerville" w:hAnsi="Baskerville"/>
-                <w:i/>
-                <w:iCs/>
-                <w:sz w:val="21"/>
-                <w:szCs w:val="21"/>
-              </w:rPr>
-              <w:t>libere</w:t>
-            </w:r>
-            <w:proofErr w:type="spellEnd"/>
+            <w:r>
+              <w:rPr>
+                <w:rFonts w:ascii="Baskerville" w:hAnsi="Baskerville"/>
+                <w:i/>
+                <w:iCs/>
+                <w:sz w:val="21"/>
+                <w:szCs w:val="21"/>
+              </w:rPr>
+              <w:t>système</w:t>
+            </w:r>
+            <w:r>
+              <w:rPr>
+                <w:rFonts w:ascii="Baskerville" w:hAnsi="Baskerville"/>
+                <w:i/>
+                <w:iCs/>
+                <w:sz w:val="21"/>
+                <w:szCs w:val="21"/>
+              </w:rPr>
+              <w:t xml:space="preserve"> tant qu</w:t>
+            </w:r>
+            <w:r>
+              <w:rPr>
+                <w:rFonts w:ascii="Baskerville" w:hAnsi="Baskerville"/>
+                <w:i/>
+                <w:iCs/>
+                <w:sz w:val="21"/>
+                <w:szCs w:val="21"/>
+              </w:rPr>
+              <w:t>’</w:t>
+            </w:r>
+            <w:r>
+              <w:rPr>
+                <w:rFonts w:ascii="Baskerville" w:hAnsi="Baskerville"/>
+                <w:i/>
+                <w:iCs/>
+                <w:sz w:val="21"/>
+                <w:szCs w:val="21"/>
+              </w:rPr>
+              <w:t>il n</w:t>
+            </w:r>
+            <w:r>
+              <w:rPr>
+                <w:rFonts w:ascii="Baskerville" w:hAnsi="Baskerville"/>
+                <w:i/>
+                <w:iCs/>
+                <w:sz w:val="21"/>
+                <w:szCs w:val="21"/>
+              </w:rPr>
+              <w:t>’</w:t>
+            </w:r>
+            <w:r>
+              <w:rPr>
+                <w:rFonts w:ascii="Baskerville" w:hAnsi="Baskerville"/>
+                <w:i/>
+                <w:iCs/>
+                <w:sz w:val="21"/>
+                <w:szCs w:val="21"/>
+              </w:rPr>
+              <w:t xml:space="preserve">est pas </w:t>
+            </w:r>
+            <w:r>
+              <w:rPr>
+                <w:rFonts w:ascii="Baskerville" w:hAnsi="Baskerville"/>
+                <w:i/>
+                <w:iCs/>
+                <w:sz w:val="21"/>
+                <w:szCs w:val="21"/>
+              </w:rPr>
+              <w:t>libéré</w:t>
+            </w:r>
             <w:r>
               <w:rPr>
                 <w:rFonts w:ascii="Baskerville" w:hAnsi="Baskerville"/>
@@ -18763,34 +18867,14 @@
           <w:szCs w:val="24"/>
         </w:rPr>
       </w:pPr>
-      <w:proofErr w:type="spellStart"/>
       <w:r>
         <w:rPr>
           <w:rFonts w:ascii="Baskerville" w:hAnsi="Baskerville"/>
           <w:sz w:val="24"/>
           <w:szCs w:val="24"/>
         </w:rPr>
-        <w:t>Fonctionnalites</w:t>
-      </w:r>
-      <w:proofErr w:type="spellEnd"/>
-      <w:r>
-        <w:rPr>
-          <w:rFonts w:ascii="Baskerville" w:hAnsi="Baskerville"/>
-          <w:sz w:val="24"/>
-          <w:szCs w:val="24"/>
-        </w:rPr>
-        <w:t xml:space="preserve"> </w:t>
-      </w:r>
-      <w:proofErr w:type="spellStart"/>
-      <w:r>
-        <w:rPr>
-          <w:rFonts w:ascii="Baskerville" w:hAnsi="Baskerville"/>
-          <w:sz w:val="24"/>
-          <w:szCs w:val="24"/>
-        </w:rPr>
-        <w:t>cles</w:t>
-      </w:r>
-      <w:proofErr w:type="spellEnd"/>
+        <w:t>Fonctionnalités clés</w:t>
+      </w:r>
     </w:p>
     <w:p>
       <w:pPr>
@@ -18814,16 +18898,14 @@
         </w:rPr>
         <w:t xml:space="preserve">Tableau de bord de tous les lots en attente de </w:t>
       </w:r>
-      <w:proofErr w:type="spellStart"/>
-      <w:r>
-        <w:rPr>
-          <w:rFonts w:ascii="Baskerville" w:hAnsi="Baskerville"/>
-          <w:sz w:val="22"/>
-          <w:szCs w:val="22"/>
-        </w:rPr>
-        <w:t>liberation</w:t>
-      </w:r>
-      <w:proofErr w:type="spellEnd"/>
+      <w:r>
+        <w:rPr>
+          <w:rFonts w:ascii="Baskerville" w:hAnsi="Baskerville"/>
+          <w:sz w:val="22"/>
+          <w:szCs w:val="22"/>
+        </w:rPr>
+        <w:t>libération</w:t>
+      </w:r>
     </w:p>
     <w:p>
       <w:pPr>
@@ -18847,23 +18929,37 @@
         </w:rPr>
         <w:t xml:space="preserve">Saisie et consultation des </w:t>
       </w:r>
-      <w:proofErr w:type="spellStart"/>
-      <w:r>
-        <w:rPr>
-          <w:rFonts w:ascii="Baskerville" w:hAnsi="Baskerville"/>
-          <w:sz w:val="22"/>
-          <w:szCs w:val="22"/>
-        </w:rPr>
-        <w:t>resultats</w:t>
-      </w:r>
-      <w:proofErr w:type="spellEnd"/>
-      <w:r>
-        <w:rPr>
-          <w:rFonts w:ascii="Baskerville" w:hAnsi="Baskerville"/>
-          <w:sz w:val="22"/>
-          <w:szCs w:val="22"/>
-        </w:rPr>
-        <w:t xml:space="preserve"> d'analyse (labo)</w:t>
+      <w:r>
+        <w:rPr>
+          <w:rFonts w:ascii="Baskerville" w:hAnsi="Baskerville"/>
+          <w:sz w:val="22"/>
+          <w:szCs w:val="22"/>
+        </w:rPr>
+        <w:t>résultats</w:t>
+      </w:r>
+      <w:r>
+        <w:rPr>
+          <w:rFonts w:ascii="Baskerville" w:hAnsi="Baskerville"/>
+          <w:sz w:val="22"/>
+          <w:szCs w:val="22"/>
+        </w:rPr>
+        <w:t xml:space="preserve"> d</w:t>
+      </w:r>
+      <w:r>
+        <w:rPr>
+          <w:rFonts w:ascii="Baskerville" w:hAnsi="Baskerville"/>
+          <w:sz w:val="22"/>
+          <w:szCs w:val="22"/>
+        </w:rPr>
+        <w:t>’</w:t>
+      </w:r>
+      <w:r>
+        <w:rPr>
+          <w:rFonts w:ascii="Baskerville" w:hAnsi="Baskerville"/>
+          <w:sz w:val="22"/>
+          <w:szCs w:val="22"/>
+        </w:rPr>
+        <w:t>analyse (labo)</w:t>
       </w:r>
     </w:p>
     <w:p>
@@ -18880,52 +18976,22 @@
           <w:szCs w:val="22"/>
         </w:rPr>
       </w:pPr>
-      <w:proofErr w:type="spellStart"/>
-      <w:r>
-        <w:rPr>
-          <w:rFonts w:ascii="Baskerville" w:hAnsi="Baskerville"/>
-          <w:sz w:val="22"/>
-          <w:szCs w:val="22"/>
-        </w:rPr>
-        <w:t>Decision</w:t>
-      </w:r>
-      <w:proofErr w:type="spellEnd"/>
-      <w:r>
-        <w:rPr>
-          <w:rFonts w:ascii="Baskerville" w:hAnsi="Baskerville"/>
-          <w:sz w:val="22"/>
-          <w:szCs w:val="22"/>
-        </w:rPr>
-        <w:t xml:space="preserve"> de </w:t>
-      </w:r>
-      <w:proofErr w:type="spellStart"/>
-      <w:r>
-        <w:rPr>
-          <w:rFonts w:ascii="Baskerville" w:hAnsi="Baskerville"/>
-          <w:sz w:val="22"/>
-          <w:szCs w:val="22"/>
-        </w:rPr>
-        <w:t>liberation</w:t>
-      </w:r>
-      <w:proofErr w:type="spellEnd"/>
-      <w:r>
-        <w:rPr>
-          <w:rFonts w:ascii="Baskerville" w:hAnsi="Baskerville"/>
-          <w:sz w:val="22"/>
-          <w:szCs w:val="22"/>
-        </w:rPr>
-        <w:t xml:space="preserve">, blocage ou mise en quarantaine </w:t>
-      </w:r>
-      <w:proofErr w:type="spellStart"/>
-      <w:r>
-        <w:rPr>
-          <w:rFonts w:ascii="Baskerville" w:hAnsi="Baskerville"/>
-          <w:sz w:val="22"/>
-          <w:szCs w:val="22"/>
-        </w:rPr>
-        <w:t>prolongee</w:t>
-      </w:r>
-      <w:proofErr w:type="spellEnd"/>
+      <w:r>
+        <w:rPr>
+          <w:rFonts w:ascii="Baskerville" w:hAnsi="Baskerville"/>
+          <w:sz w:val="22"/>
+          <w:szCs w:val="22"/>
+        </w:rPr>
+        <w:t xml:space="preserve">Décision de libération, blocage ou mise en quarantaine </w:t>
+      </w:r>
+      <w:r>
+        <w:rPr>
+          <w:rFonts w:ascii="Baskerville" w:hAnsi="Baskerville"/>
+          <w:sz w:val="22"/>
+          <w:szCs w:val="22"/>
+        </w:rPr>
+        <w:t>prolongée</w:t>
+      </w:r>
     </w:p>
     <w:p>
       <w:pPr>
@@ -18941,34 +19007,22 @@
           <w:szCs w:val="22"/>
         </w:rPr>
       </w:pPr>
-      <w:proofErr w:type="spellStart"/>
-      <w:r>
-        <w:rPr>
-          <w:rFonts w:ascii="Baskerville" w:hAnsi="Baskerville"/>
-          <w:sz w:val="22"/>
-          <w:szCs w:val="22"/>
-        </w:rPr>
-        <w:t>Tracabilite</w:t>
-      </w:r>
-      <w:proofErr w:type="spellEnd"/>
-      <w:r>
-        <w:rPr>
-          <w:rFonts w:ascii="Baskerville" w:hAnsi="Baskerville"/>
-          <w:sz w:val="22"/>
-          <w:szCs w:val="22"/>
-        </w:rPr>
-        <w:t xml:space="preserve"> de qui a </w:t>
-      </w:r>
-      <w:proofErr w:type="spellStart"/>
-      <w:r>
-        <w:rPr>
-          <w:rFonts w:ascii="Baskerville" w:hAnsi="Baskerville"/>
-          <w:sz w:val="22"/>
-          <w:szCs w:val="22"/>
-        </w:rPr>
-        <w:t>decide</w:t>
-      </w:r>
-      <w:proofErr w:type="spellEnd"/>
+      <w:r>
+        <w:rPr>
+          <w:rFonts w:ascii="Baskerville" w:hAnsi="Baskerville"/>
+          <w:sz w:val="22"/>
+          <w:szCs w:val="22"/>
+        </w:rPr>
+        <w:t xml:space="preserve">Traçabilité de qui a </w:t>
+      </w:r>
+      <w:r>
+        <w:rPr>
+          <w:rFonts w:ascii="Baskerville" w:hAnsi="Baskerville"/>
+          <w:sz w:val="22"/>
+          <w:szCs w:val="22"/>
+        </w:rPr>
+        <w:t>décidé</w:t>
+      </w:r>
       <w:r>
         <w:rPr>
           <w:rFonts w:ascii="Baskerville" w:hAnsi="Baskerville"/>
@@ -19831,23 +19885,13 @@
           <w:szCs w:val="22"/>
         </w:rPr>
       </w:pPr>
-      <w:proofErr w:type="spellStart"/>
-      <w:r>
-        <w:rPr>
-          <w:rFonts w:ascii="Baskerville" w:hAnsi="Baskerville"/>
-          <w:sz w:val="22"/>
-          <w:szCs w:val="22"/>
-        </w:rPr>
-        <w:t>Reporting</w:t>
-      </w:r>
-      <w:proofErr w:type="spellEnd"/>
-      <w:r>
-        <w:rPr>
-          <w:rFonts w:ascii="Baskerville" w:hAnsi="Baskerville"/>
-          <w:sz w:val="22"/>
-          <w:szCs w:val="22"/>
-        </w:rPr>
-        <w:t xml:space="preserve"> pour les audits de certification</w:t>
+      <w:r>
+        <w:rPr>
+          <w:rFonts w:ascii="Baskerville" w:hAnsi="Baskerville"/>
+          <w:sz w:val="22"/>
+          <w:szCs w:val="22"/>
+        </w:rPr>
+        <w:t>Reporting pour les audits de certification</w:t>
       </w:r>
     </w:p>
     <w:p>

</xml_diff>